<commit_message>
Remove rate on line from results, export, and documentation
RoL is premium divided by limit, so it depends on which premium is used,
but it was computed only from the expected value premium. With two premium
methods shown, a single RoL column is ambiguous, so drop it everywhere: the
results table, the priced output (and therefore the exported workbook), the
test fixture, and both the markdown and Word technical documentation.

Co-Authored-By: Claude Opus 4.8 <noreply@anthropic.com>
</commit_message>
<xml_diff>
--- a/Technical documentation.docx
+++ b/Technical documentation.docx
@@ -2391,7 +2391,7 @@
         <w:t xml:space="preserve"> </w:t>
       </w:r>
       <w:r>
-        <w:t xml:space="preserve">VaR, TVaR, rate on line, both premiums, the closed-form expected loss, and the</w:t>
+        <w:t xml:space="preserve">VaR, TVaR, both premiums, the closed-form expected loss, and the</w:t>
       </w:r>
       <w:r>
         <w:t xml:space="preserve"> </w:t>
@@ -6610,72 +6610,6 @@
       </w:r>
       <w:r>
         <w:t xml:space="preserve">the VaR.</w:t>
-      </w:r>
-    </w:p>
-    <w:p>
-      <w:pPr>
-        <w:pStyle w:val="Compact"/>
-        <w:numPr>
-          <w:ilvl w:val="0"/>
-          <w:numId w:val="1012"/>
-        </w:numPr>
-      </w:pPr>
-      <w:r>
-        <w:rPr>
-          <w:b/>
-          <w:bCs/>
-        </w:rPr>
-        <w:t xml:space="preserve">Rate on line</w:t>
-      </w:r>
-      <w:r>
-        <w:t xml:space="preserve"> </w:t>
-      </w:r>
-      <m:oMath>
-        <m:r>
-          <m:rPr>
-            <m:sty m:val="p"/>
-          </m:rPr>
-          <m:t>R</m:t>
-        </m:r>
-        <m:r>
-          <m:rPr>
-            <m:sty m:val="p"/>
-          </m:rPr>
-          <m:t>o</m:t>
-        </m:r>
-        <m:r>
-          <m:rPr>
-            <m:sty m:val="p"/>
-          </m:rPr>
-          <m:t>L</m:t>
-        </m:r>
-        <m:r>
-          <m:rPr>
-            <m:sty m:val="p"/>
-          </m:rPr>
-          <m:t>=</m:t>
-        </m:r>
-        <m:r>
-          <m:t>P</m:t>
-        </m:r>
-        <m:r>
-          <m:rPr>
-            <m:sty m:val="p"/>
-          </m:rPr>
-          <m:t>/</m:t>
-        </m:r>
-        <m:r>
-          <m:t>C</m:t>
-        </m:r>
-      </m:oMath>
-      <w:r>
-        <w:t xml:space="preserve">, the premium relative to the layer</w:t>
-      </w:r>
-      <w:r>
-        <w:t xml:space="preserve"> </w:t>
-      </w:r>
-      <w:r>
-        <w:t xml:space="preserve">width.</w:t>
       </w:r>
     </w:p>
     <w:p>

</xml_diff>

<commit_message>
Rework the Model step: drop the mean excess plot, add a frequency summary
Two related Model-step changes:

- Remove the mean excess plot. With so few data points it added little, so
  drop the plot, its render, and the now-unused mean_excess function (plus its
  test and the references in both the markdown and Word documentation).
- Add a frequency summary. The step fits frequency and severity but showed
  almost nothing about frequency, so add a small Frequency table with the model,
  the expected claims per year (exposure scaled), the observed average and the
  number of years observed. The severity parameters move to their own table and
  the mislabelled "Frequency lambda" row is gone.

Co-Authored-By: Claude Opus 4.8 <noreply@anthropic.com>
</commit_message>
<xml_diff>
--- a/Technical documentation.docx
+++ b/Technical documentation.docx
@@ -2639,7 +2639,7 @@
               <w:pStyle w:val="Compact"/>
             </w:pPr>
             <w:r>
-              <w:t xml:space="preserve">fit the spliced lognormal and Pareto, survival, sampler, mean excess</w:t>
+              <w:t xml:space="preserve">fit the spliced lognormal and Pareto, survival, sampler</w:t>
             </w:r>
           </w:p>
         </w:tc>
@@ -5512,146 +5512,7 @@
         <w:t xml:space="preserve"> </w:t>
       </w:r>
       <w:r>
-        <w:t xml:space="preserve">empties the body and collapses the model</w:t>
-      </w:r>
-      <w:r>
-        <w:t xml:space="preserve"> </w:t>
-      </w:r>
-      <w:r>
-        <w:t xml:space="preserve">to a single Pareto. The dashboard shows a</w:t>
-      </w:r>
-      <w:r>
-        <w:t xml:space="preserve"> </w:t>
-      </w:r>
-      <w:r>
-        <w:rPr>
-          <w:b/>
-          <w:bCs/>
-        </w:rPr>
-        <w:t xml:space="preserve">mean excess plot</w:t>
-      </w:r>
-      <w:r>
-        <w:t xml:space="preserve">, the empirical</w:t>
-      </w:r>
-      <w:r>
-        <w:t xml:space="preserve"> </w:t>
-      </w:r>
-      <m:oMath>
-        <m:r>
-          <m:t>e</m:t>
-        </m:r>
-        <m:d>
-          <m:dPr>
-            <m:begChr m:val="("/>
-            <m:sepChr m:val=""/>
-            <m:endChr m:val=")"/>
-            <m:grow/>
-          </m:dPr>
-          <m:e>
-            <m:r>
-              <m:t>u</m:t>
-            </m:r>
-          </m:e>
-        </m:d>
-        <m:r>
-          <m:rPr>
-            <m:sty m:val="p"/>
-          </m:rPr>
-          <m:t>=</m:t>
-        </m:r>
-        <m:r>
-          <m:rPr>
-            <m:sty m:val="p"/>
-          </m:rPr>
-          <m:t>m</m:t>
-        </m:r>
-        <m:r>
-          <m:rPr>
-            <m:sty m:val="p"/>
-          </m:rPr>
-          <m:t>e</m:t>
-        </m:r>
-        <m:r>
-          <m:rPr>
-            <m:sty m:val="p"/>
-          </m:rPr>
-          <m:t>a</m:t>
-        </m:r>
-        <m:r>
-          <m:rPr>
-            <m:sty m:val="p"/>
-          </m:rPr>
-          <m:t>n</m:t>
-        </m:r>
-        <m:d>
-          <m:dPr>
-            <m:begChr m:val="("/>
-            <m:sepChr m:val=""/>
-            <m:endChr m:val=")"/>
-            <m:grow/>
-          </m:dPr>
-          <m:e>
-            <m:r>
-              <m:t>X</m:t>
-            </m:r>
-            <m:r>
-              <m:rPr>
-                <m:sty m:val="p"/>
-              </m:rPr>
-              <m:t>−</m:t>
-            </m:r>
-            <m:r>
-              <m:t>u</m:t>
-            </m:r>
-            <m:r>
-              <m:rPr>
-                <m:sty m:val="p"/>
-              </m:rPr>
-              <m:t>∣</m:t>
-            </m:r>
-            <m:r>
-              <m:t>X</m:t>
-            </m:r>
-            <m:r>
-              <m:rPr>
-                <m:sty m:val="p"/>
-              </m:rPr>
-              <m:t>&gt;</m:t>
-            </m:r>
-            <m:r>
-              <m:t>u</m:t>
-            </m:r>
-          </m:e>
-        </m:d>
-      </m:oMath>
-      <w:r>
-        <w:t xml:space="preserve">, which is roughly linear in</w:t>
-      </w:r>
-      <w:r>
-        <w:t xml:space="preserve"> </w:t>
-      </w:r>
-      <m:oMath>
-        <m:r>
-          <m:t>u</m:t>
-        </m:r>
-      </m:oMath>
-      <w:r>
-        <w:t xml:space="preserve"> </w:t>
-      </w:r>
-      <w:r>
-        <w:t xml:space="preserve">where a</w:t>
-      </w:r>
-      <w:r>
-        <w:t xml:space="preserve"> </w:t>
-      </w:r>
-      <w:r>
-        <w:t xml:space="preserve">Pareto tail fits well; this helps the user choose where the tail begins. It also</w:t>
-      </w:r>
-      <w:r>
-        <w:t xml:space="preserve"> </w:t>
-      </w:r>
-      <w:r>
-        <w:t xml:space="preserve">shows the fitted versus empirical severity CDF.</w:t>
+        <w:t xml:space="preserve">empties the body and collapses the model to a single Pareto. The dashboard shows the fitted versus empirical severity CDF, which updates live as the thresholds move so the user can see how well the fit matches the data and choose where the tail begins.</w:t>
       </w:r>
     </w:p>
     <w:bookmarkEnd w:id="33"/>

</xml_diff>

<commit_message>
Show the as-if burning cost in the validation table
The pipeline already computed burning cost but never surfaced it. The Price
step now computes it on each run and adds an as-if burning cost column to the
Validation table, so the modelled expected loss can be sense-checked against
what each layer has historically cost (indexed and exposure corrected). The
More information panel and both technical docs explain the as-if basis.

Co-Authored-By: Claude Opus 4.8 <noreply@anthropic.com>
</commit_message>
<xml_diff>
--- a/Technical documentation.docx
+++ b/Technical documentation.docx
@@ -7181,6 +7181,23 @@
       </w:r>
       <w:r>
         <w:t xml:space="preserve">(AAD and AAL) and the volatility and tail metrics come from the simulation only.</w:t>
+      </w:r>
+    </w:p>
+    <w:p>
+      <w:pPr>
+        <w:pStyle w:val="FirstParagraph"/>
+      </w:pPr>
+      <w:r>
+        <w:t xml:space="preserve">Alongside the oracle, the Validation table also shows the </w:t>
+      </w:r>
+      <w:r>
+        <w:rPr>
+          <w:b/>
+        </w:rPr>
+        <w:t xml:space="preserve">burning cost</w:t>
+      </w:r>
+      <w:r>
+        <w:t xml:space="preserve">: the average annual loss to each layer taken straight from the history, on an as-if basis (every past loss indexed for inflation and corrected for exposure, as if it had happened in the valuation year). Unlike the oracle, this carries no model, so it is the external sense-check. Where the history is thick the modelled expected loss should sit close to it; for a high layer above the historical experience the burning cost reads near zero and the fitted Pareto tail is doing the work, which is exactly where a parametric model earns its keep.</w:t>
       </w:r>
     </w:p>
     <w:bookmarkEnd w:id="36"/>

</xml_diff>

<commit_message>
Remove the build scaffolding docs, keep the roadmap
The design spec and implementation plan under docs/superpowers were pre-build
scaffolding that had drifted (they still listed Rate-on-line and the removed
mean-excess plot). Their methodology is already in documentation.md, so harvest
the one unique piece, the v2 roadmap, into a Future work section in both
technical docs, then delete the scaffolding. Repoint every reference that named
the deleted files (README, engine/CLAUDE.md, documentation.md, the Word doc).

Co-Authored-By: Claude Opus 4.8 <noreply@anthropic.com>
</commit_message>
<xml_diff>
--- a/Technical documentation.docx
+++ b/Technical documentation.docx
@@ -1351,7 +1351,7 @@
               <w:pStyle w:val="Compact"/>
             </w:pPr>
             <w:r>
-              <w:t xml:space="preserve">This documentation and the design spec and plan.</w:t>
+              <w:t xml:space="preserve">The Markdown source of this documentation.</w:t>
             </w:r>
           </w:p>
         </w:tc>
@@ -7365,6 +7365,22 @@
     </w:p>
     <w:bookmarkEnd w:id="37"/>
     <w:bookmarkEnd w:id="38"/>
+    <w:p>
+      <w:pPr>
+        <w:pStyle w:val="Heading2"/>
+      </w:pPr>
+      <w:r>
+        <w:t xml:space="preserve">Future work</w:t>
+      </w:r>
+    </w:p>
+    <w:p>
+      <w:pPr>
+        <w:pStyle w:val="FirstParagraph"/>
+      </w:pPr>
+      <w:r>
+        <w:t xml:space="preserve">Several extensions were planned but deferred from v1, and the engine was structured to accommodate them without rework: proportional treaties (quota share and surplus), loss development and IBNR for long-tail lines, exposure rating curves for low-data lines, and portfolio aggregation across several lines of business (v1 prices a single book at a time).</w:t>
+      </w:r>
+    </w:p>
     <w:bookmarkStart w:id="39" w:name="references"/>
     <w:p>
       <w:pPr>
@@ -7420,7 +7436,7 @@
         </w:numPr>
       </w:pPr>
       <w:r>
-        <w:t xml:space="preserve">The full design specification and implementation plan are in</w:t>
+        <w:t xml:space="preserve">The design and methodology are documented here; the implementation is in the R modules under</w:t>
       </w:r>
       <w:r>
         <w:t xml:space="preserve"> </w:t>
@@ -7429,7 +7445,16 @@
         <w:rPr>
           <w:rStyle w:val="VerbatimChar"/>
         </w:rPr>
-        <w:t xml:space="preserve">engine/docs/superpowers/</w:t>
+        <w:t xml:space="preserve">engine/R/</w:t>
+      </w:r>
+      <w:r>
+        <w:t xml:space="preserve">, each with a matching test under </w:t>
+      </w:r>
+      <w:r>
+        <w:rPr>
+          <w:rStyle w:val="VerbatimChar"/>
+        </w:rPr>
+        <w:t xml:space="preserve">engine/tests/testthat/</w:t>
       </w:r>
       <w:r>
         <w:t xml:space="preserve">.</w:t>

</xml_diff>

<commit_message>
Cut documentation duplication and generate the Word doc
The README repeated documentation.md's input schema and four-step walkthrough,
which is how it drifted before. Trim those to summaries that link to the
technical doc, keeping the README as a front door for the launcher and quick
start. Stop hand-maintaining the Word copy: documentation.md is the single
source, and engine/docs/build_docx.R regenerates Technical documentation.docx
from it with pandoc (bundled with RStudio/Quarto). Ignore Office lock files.

Co-Authored-By: Claude Opus 4.8 <noreply@anthropic.com>
</commit_message>
<xml_diff>
--- a/Technical documentation.docx
+++ b/Technical documentation.docx
@@ -34,32 +34,6 @@
         <w:t xml:space="preserve">June 2026</w:t>
       </w:r>
     </w:p>
-    <w:sdt>
-      <w:sdtPr>
-        <w:docPartObj>
-          <w:docPartGallery w:val="Table of Contents"/>
-          <w:docPartUnique/>
-        </w:docPartObj>
-      </w:sdtPr>
-      <w:sdtContent>
-        <w:p>
-          <w:pPr>
-            <w:pStyle w:val="TOCHeading"/>
-          </w:pPr>
-          <w:r>
-            <w:t xml:space="preserve">Table of Contents</w:t>
-          </w:r>
-        </w:p>
-        <w:p>
-          <w:r>
-            <w:fldChar w:fldCharType="begin" w:dirty="true"/>
-            <w:instrText xml:space="preserve">TOC \o "1-2" \h \z \u</w:instrText>
-            <w:fldChar w:fldCharType="separate"/>
-            <w:fldChar w:fldCharType="end"/>
-          </w:r>
-        </w:p>
-      </w:sdtContent>
-    </w:sdt>
     <w:bookmarkStart w:id="20" w:name="introduction"/>
     <w:p>
       <w:pPr>
@@ -1351,7 +1325,7 @@
               <w:pStyle w:val="Compact"/>
             </w:pPr>
             <w:r>
-              <w:t xml:space="preserve">The Markdown source of this documentation.</w:t>
+              <w:t xml:space="preserve">This documentation (Markdown; a Word copy is at the repo root).</w:t>
             </w:r>
           </w:p>
         </w:tc>
@@ -2969,7 +2943,7 @@
     </w:p>
     <w:bookmarkEnd w:id="29"/>
     <w:bookmarkEnd w:id="30"/>
-    <w:bookmarkStart w:id="38" w:name="part-2-actuarial-methodology"/>
+    <w:bookmarkStart w:id="39" w:name="part-2-actuarial-methodology"/>
     <w:p>
       <w:pPr>
         <w:pStyle w:val="Heading1"/>
@@ -5512,7 +5486,25 @@
         <w:t xml:space="preserve"> </w:t>
       </w:r>
       <w:r>
-        <w:t xml:space="preserve">empties the body and collapses the model to a single Pareto. The dashboard shows the fitted versus empirical severity CDF, which updates live as the thresholds move so the user can see how well the fit matches the data and choose where the tail begins.</w:t>
+        <w:t xml:space="preserve">empties the body and collapses the model</w:t>
+      </w:r>
+      <w:r>
+        <w:t xml:space="preserve"> </w:t>
+      </w:r>
+      <w:r>
+        <w:t xml:space="preserve">to a single Pareto. The dashboard shows the fitted versus empirical severity CDF,</w:t>
+      </w:r>
+      <w:r>
+        <w:t xml:space="preserve"> </w:t>
+      </w:r>
+      <w:r>
+        <w:t xml:space="preserve">which updates live as the thresholds move so the user can see how well the fit</w:t>
+      </w:r>
+      <w:r>
+        <w:t xml:space="preserve"> </w:t>
+      </w:r>
+      <w:r>
+        <w:t xml:space="preserve">matches the data and choose where the tail begins.</w:t>
       </w:r>
     </w:p>
     <w:bookmarkEnd w:id="33"/>
@@ -7185,19 +7177,65 @@
     </w:p>
     <w:p>
       <w:pPr>
-        <w:pStyle w:val="FirstParagraph"/>
-      </w:pPr>
-      <w:r>
-        <w:t xml:space="preserve">Alongside the oracle, the Validation table also shows the </w:t>
+        <w:pStyle w:val="BodyText"/>
+      </w:pPr>
+      <w:r>
+        <w:t xml:space="preserve">Alongside the oracle, the Validation table also shows the</w:t>
+      </w:r>
+      <w:r>
+        <w:t xml:space="preserve"> </w:t>
       </w:r>
       <w:r>
         <w:rPr>
           <w:b/>
+          <w:bCs/>
         </w:rPr>
         <w:t xml:space="preserve">burning cost</w:t>
       </w:r>
       <w:r>
-        <w:t xml:space="preserve">: the average annual loss to each layer taken straight from the history, on an as-if basis (every past loss indexed for inflation and corrected for exposure, as if it had happened in the valuation year). Unlike the oracle, this carries no model, so it is the external sense-check. Where the history is thick the modelled expected loss should sit close to it; for a high layer above the historical experience the burning cost reads near zero and the fitted Pareto tail is doing the work, which is exactly where a parametric model earns its keep.</w:t>
+        <w:t xml:space="preserve">: the</w:t>
+      </w:r>
+      <w:r>
+        <w:t xml:space="preserve"> </w:t>
+      </w:r>
+      <w:r>
+        <w:t xml:space="preserve">average annual loss to each layer taken straight from the history, on an as-if</w:t>
+      </w:r>
+      <w:r>
+        <w:t xml:space="preserve"> </w:t>
+      </w:r>
+      <w:r>
+        <w:t xml:space="preserve">basis (every past loss indexed for inflation and corrected for exposure, as if it</w:t>
+      </w:r>
+      <w:r>
+        <w:t xml:space="preserve"> </w:t>
+      </w:r>
+      <w:r>
+        <w:t xml:space="preserve">had happened in the valuation year). Unlike the oracle, this carries no model, so</w:t>
+      </w:r>
+      <w:r>
+        <w:t xml:space="preserve"> </w:t>
+      </w:r>
+      <w:r>
+        <w:t xml:space="preserve">it is the external sense-check. Where the history is thick the modelled expected</w:t>
+      </w:r>
+      <w:r>
+        <w:t xml:space="preserve"> </w:t>
+      </w:r>
+      <w:r>
+        <w:t xml:space="preserve">loss should sit close to it; for a high layer above the historical experience the</w:t>
+      </w:r>
+      <w:r>
+        <w:t xml:space="preserve"> </w:t>
+      </w:r>
+      <w:r>
+        <w:t xml:space="preserve">burning cost reads near zero and the fitted Pareto tail is doing the work, which</w:t>
+      </w:r>
+      <w:r>
+        <w:t xml:space="preserve"> </w:t>
+      </w:r>
+      <w:r>
+        <w:t xml:space="preserve">is exactly where a parametric model earns its keep.</w:t>
       </w:r>
     </w:p>
     <w:bookmarkEnd w:id="36"/>
@@ -7356,6 +7394,48 @@
         <w:t xml:space="preserve">support that choice.</w:t>
       </w:r>
     </w:p>
+    <w:bookmarkEnd w:id="37"/>
+    <w:bookmarkStart w:id="38" w:name="future-work"/>
+    <w:p>
+      <w:pPr>
+        <w:pStyle w:val="Heading2"/>
+      </w:pPr>
+      <w:r>
+        <w:t xml:space="preserve">Future work</w:t>
+      </w:r>
+    </w:p>
+    <w:p>
+      <w:pPr>
+        <w:pStyle w:val="FirstParagraph"/>
+      </w:pPr>
+      <w:r>
+        <w:t xml:space="preserve">Several extensions were planned but deferred from v1, and the engine was</w:t>
+      </w:r>
+      <w:r>
+        <w:t xml:space="preserve"> </w:t>
+      </w:r>
+      <w:r>
+        <w:t xml:space="preserve">structured to accommodate them without rework: proportional treaties (quota</w:t>
+      </w:r>
+      <w:r>
+        <w:t xml:space="preserve"> </w:t>
+      </w:r>
+      <w:r>
+        <w:t xml:space="preserve">share and surplus), loss development and IBNR for long-tail lines, exposure</w:t>
+      </w:r>
+      <w:r>
+        <w:t xml:space="preserve"> </w:t>
+      </w:r>
+      <w:r>
+        <w:t xml:space="preserve">rating curves for low-data lines, and portfolio aggregation across several lines</w:t>
+      </w:r>
+      <w:r>
+        <w:t xml:space="preserve"> </w:t>
+      </w:r>
+      <w:r>
+        <w:t xml:space="preserve">of business (v1 prices a single book at a time).</w:t>
+      </w:r>
+    </w:p>
     <w:p>
       <w:r>
         <w:pict>
@@ -7363,25 +7443,9 @@
         </w:pict>
       </w:r>
     </w:p>
-    <w:bookmarkEnd w:id="37"/>
     <w:bookmarkEnd w:id="38"/>
-    <w:p>
-      <w:pPr>
-        <w:pStyle w:val="Heading2"/>
-      </w:pPr>
-      <w:r>
-        <w:t xml:space="preserve">Future work</w:t>
-      </w:r>
-    </w:p>
-    <w:p>
-      <w:pPr>
-        <w:pStyle w:val="FirstParagraph"/>
-      </w:pPr>
-      <w:r>
-        <w:t xml:space="preserve">Several extensions were planned but deferred from v1, and the engine was structured to accommodate them without rework: proportional treaties (quota share and surplus), loss development and IBNR for long-tail lines, exposure rating curves for low-data lines, and portfolio aggregation across several lines of business (v1 prices a single book at a time).</w:t>
-      </w:r>
-    </w:p>
-    <w:bookmarkStart w:id="39" w:name="references"/>
+    <w:bookmarkEnd w:id="39"/>
+    <w:bookmarkStart w:id="40" w:name="references"/>
     <w:p>
       <w:pPr>
         <w:pStyle w:val="Heading1"/>
@@ -7436,7 +7500,13 @@
         </w:numPr>
       </w:pPr>
       <w:r>
-        <w:t xml:space="preserve">The design and methodology are documented here; the implementation is in the R modules under</w:t>
+        <w:t xml:space="preserve">The design and methodology are documented here; the implementation is in the</w:t>
+      </w:r>
+      <w:r>
+        <w:t xml:space="preserve"> </w:t>
+      </w:r>
+      <w:r>
+        <w:t xml:space="preserve">R modules under</w:t>
       </w:r>
       <w:r>
         <w:t xml:space="preserve"> </w:t>
@@ -7448,7 +7518,10 @@
         <w:t xml:space="preserve">engine/R/</w:t>
       </w:r>
       <w:r>
-        <w:t xml:space="preserve">, each with a matching test under </w:t>
+        <w:t xml:space="preserve">, each with a matching test in</w:t>
+      </w:r>
+      <w:r>
+        <w:t xml:space="preserve"> </w:t>
       </w:r>
       <w:r>
         <w:rPr>
@@ -7460,7 +7533,7 @@
         <w:t xml:space="preserve">.</w:t>
       </w:r>
     </w:p>
-    <w:bookmarkEnd w:id="39"/>
+    <w:bookmarkEnd w:id="40"/>
     <w:sectPr>
       <w:footnotePr>
         <w:numRestart w:val="eachSect"/>

</xml_diff>

<commit_message>
Default the modelling threshold to the smallest loss, drop reporting_threshold
The reporting threshold's only job was seeding the default modelling threshold,
which the data already implies, so it was a confusing input to ask for. Stop
reading it from the workbook (only valuation_year stays required) and default MT
to the smallest historical loss, so the model includes every loss until the user
raises it. Existing workbooks still load; the old key is simply ignored. Updates
the example template, tests (with a new default-MT test), the in-app help, and
the documentation, and regenerates the Word copy.

Co-Authored-By: Claude Opus 4.8 <noreply@anthropic.com>
</commit_message>
<xml_diff>
--- a/Technical documentation.docx
+++ b/Technical documentation.docx
@@ -2108,7 +2108,7 @@
         <w:t xml:space="preserve"> </w:t>
       </w:r>
       <w:r>
-        <w:t xml:space="preserve">(key and value rows; only the data parameters live here,</w:t>
+        <w:t xml:space="preserve">(key and value rows; only the valuation year is required,</w:t>
       </w:r>
       <w:r>
         <w:t xml:space="preserve"> </w:t>
@@ -2120,13 +2120,12 @@
     <w:tbl>
       <w:tblPr>
         <w:tblStyle w:val="Table"/>
-        <w:tblW w:type="pct" w:w="5000"/>
-        <w:tblLayout w:type="fixed"/>
+        <w:tblW w:type="auto" w:w="0"/>
         <w:tblLook w:firstRow="1" w:lastRow="0" w:firstColumn="0" w:lastColumn="0" w:noHBand="0" w:noVBand="0" w:val="0020"/>
       </w:tblPr>
       <w:tblGrid>
-        <w:gridCol w:w="1885"/>
-        <w:gridCol w:w="3394"/>
+        <w:gridCol w:w="2640"/>
+        <w:gridCol w:w="2640"/>
         <w:gridCol w:w="2640"/>
       </w:tblGrid>
       <w:tr>
@@ -2178,44 +2177,6 @@
               <w:rPr>
                 <w:rStyle w:val="VerbatimChar"/>
               </w:rPr>
-              <w:t xml:space="preserve">reporting_threshold</w:t>
-            </w:r>
-          </w:p>
-        </w:tc>
-        <w:tc>
-          <w:tcPr/>
-          <w:p>
-            <w:pPr>
-              <w:pStyle w:val="Compact"/>
-            </w:pPr>
-            <w:r>
-              <w:t xml:space="preserve">5</w:t>
-            </w:r>
-          </w:p>
-        </w:tc>
-        <w:tc>
-          <w:tcPr/>
-          <w:p>
-            <w:pPr>
-              <w:pStyle w:val="Compact"/>
-            </w:pPr>
-            <w:r>
-              <w:t xml:space="preserve">losses below this are not present in the data</w:t>
-            </w:r>
-          </w:p>
-        </w:tc>
-      </w:tr>
-      <w:tr>
-        <w:tc>
-          <w:tcPr/>
-          <w:p>
-            <w:pPr>
-              <w:pStyle w:val="Compact"/>
-            </w:pPr>
-            <w:r>
-              <w:rPr>
-                <w:rStyle w:val="VerbatimChar"/>
-              </w:rPr>
               <w:t xml:space="preserve">valuation_year</w:t>
             </w:r>
           </w:p>
@@ -2294,7 +2255,25 @@
         <w:t xml:space="preserve">pipeline.R</w:t>
       </w:r>
       <w:r>
-        <w:t xml:space="preserve">).</w:t>
+        <w:t xml:space="preserve">). The modelling threshold has no fixed</w:t>
+      </w:r>
+      <w:r>
+        <w:t xml:space="preserve"> </w:t>
+      </w:r>
+      <w:r>
+        <w:t xml:space="preserve">built-in default: when neither the dashboard nor the workbook sets it, it starts</w:t>
+      </w:r>
+      <w:r>
+        <w:t xml:space="preserve"> </w:t>
+      </w:r>
+      <w:r>
+        <w:t xml:space="preserve">at the smallest loss in the history, so the model includes every loss until you</w:t>
+      </w:r>
+      <w:r>
+        <w:t xml:space="preserve"> </w:t>
+      </w:r>
+      <w:r>
+        <w:t xml:space="preserve">raise it.</w:t>
       </w:r>
     </w:p>
     <w:bookmarkEnd w:id="27"/>

</xml_diff>

<commit_message>
Rename the parameters sheet to general inputs; add optional currency and units
Rename the workbook's parameters sheet to "general inputs" and add two optional
fields, currency and amount_units, that label every figure. They are surfaced so
they are not inert: the Data step lists them, a caption marks the Results
("Amounts are in EUR millions"), the structure and severity plots label their
money axes, and the downloaded workbook records them. A notes column in the
sheet marks each field required or optional; the reader ignores extra columns and
treats currency/units as optional. Updates the example template, input.xlsx,
tests (105 pass), the documentation and the Word copy.

Co-Authored-By: Claude Opus 4.8 <noreply@anthropic.com>
</commit_message>
<xml_diff>
--- a/Technical documentation.docx
+++ b/Technical documentation.docx
@@ -2102,31 +2102,48 @@
           <w:b/>
           <w:bCs/>
         </w:rPr>
-        <w:t xml:space="preserve">parameters</w:t>
-      </w:r>
-      <w:r>
-        <w:t xml:space="preserve"> </w:t>
-      </w:r>
-      <w:r>
-        <w:t xml:space="preserve">(key and value rows; only the valuation year is required,</w:t>
-      </w:r>
-      <w:r>
-        <w:t xml:space="preserve"> </w:t>
-      </w:r>
-      <w:r>
-        <w:t xml:space="preserve">the modelling choices are set in the dashboard):</w:t>
+        <w:t xml:space="preserve">general inputs</w:t>
+      </w:r>
+      <w:r>
+        <w:t xml:space="preserve"> </w:t>
+      </w:r>
+      <w:r>
+        <w:t xml:space="preserve">(key and value rows; an optional</w:t>
+      </w:r>
+      <w:r>
+        <w:t xml:space="preserve"> </w:t>
+      </w:r>
+      <w:r>
+        <w:rPr>
+          <w:rStyle w:val="VerbatimChar"/>
+        </w:rPr>
+        <w:t xml:space="preserve">notes</w:t>
+      </w:r>
+      <w:r>
+        <w:t xml:space="preserve"> </w:t>
+      </w:r>
+      <w:r>
+        <w:t xml:space="preserve">column may</w:t>
+      </w:r>
+      <w:r>
+        <w:t xml:space="preserve"> </w:t>
+      </w:r>
+      <w:r>
+        <w:t xml:space="preserve">describe each field and is ignored by the reader):</w:t>
       </w:r>
     </w:p>
     <w:tbl>
       <w:tblPr>
         <w:tblStyle w:val="Table"/>
-        <w:tblW w:type="auto" w:w="0"/>
+        <w:tblW w:type="pct" w:w="5000"/>
+        <w:tblLayout w:type="fixed"/>
         <w:tblLook w:firstRow="1" w:lastRow="0" w:firstColumn="0" w:lastColumn="0" w:noHBand="0" w:noVBand="0" w:val="0020"/>
       </w:tblPr>
       <w:tblGrid>
-        <w:gridCol w:w="2640"/>
-        <w:gridCol w:w="2640"/>
-        <w:gridCol w:w="2640"/>
+        <w:gridCol w:w="1277"/>
+        <w:gridCol w:w="2299"/>
+        <w:gridCol w:w="2554"/>
+        <w:gridCol w:w="1788"/>
       </w:tblGrid>
       <w:tr>
         <w:trPr>
@@ -2161,6 +2178,17 @@
               <w:pStyle w:val="Compact"/>
             </w:pPr>
             <w:r>
+              <w:t xml:space="preserve">required</w:t>
+            </w:r>
+          </w:p>
+        </w:tc>
+        <w:tc>
+          <w:tcPr/>
+          <w:p>
+            <w:pPr>
+              <w:pStyle w:val="Compact"/>
+            </w:pPr>
+            <w:r>
               <w:t xml:space="preserve">notes</w:t>
             </w:r>
           </w:p>
@@ -2199,7 +2227,116 @@
               <w:pStyle w:val="Compact"/>
             </w:pPr>
             <w:r>
+              <w:t xml:space="preserve">yes</w:t>
+            </w:r>
+          </w:p>
+        </w:tc>
+        <w:tc>
+          <w:tcPr/>
+          <w:p>
+            <w:pPr>
+              <w:pStyle w:val="Compact"/>
+            </w:pPr>
+            <w:r>
               <w:t xml:space="preserve">the year all losses are revalued to</w:t>
+            </w:r>
+          </w:p>
+        </w:tc>
+      </w:tr>
+      <w:tr>
+        <w:tc>
+          <w:tcPr/>
+          <w:p>
+            <w:pPr>
+              <w:pStyle w:val="Compact"/>
+            </w:pPr>
+            <w:r>
+              <w:rPr>
+                <w:rStyle w:val="VerbatimChar"/>
+              </w:rPr>
+              <w:t xml:space="preserve">currency</w:t>
+            </w:r>
+          </w:p>
+        </w:tc>
+        <w:tc>
+          <w:tcPr/>
+          <w:p>
+            <w:pPr>
+              <w:pStyle w:val="Compact"/>
+            </w:pPr>
+            <w:r>
+              <w:t xml:space="preserve">EUR</w:t>
+            </w:r>
+          </w:p>
+        </w:tc>
+        <w:tc>
+          <w:tcPr/>
+          <w:p>
+            <w:pPr>
+              <w:pStyle w:val="Compact"/>
+            </w:pPr>
+            <w:r>
+              <w:t xml:space="preserve">no</w:t>
+            </w:r>
+          </w:p>
+        </w:tc>
+        <w:tc>
+          <w:tcPr/>
+          <w:p>
+            <w:pPr>
+              <w:pStyle w:val="Compact"/>
+            </w:pPr>
+            <w:r>
+              <w:t xml:space="preserve">labels every amount in the dashboard and the export</w:t>
+            </w:r>
+          </w:p>
+        </w:tc>
+      </w:tr>
+      <w:tr>
+        <w:tc>
+          <w:tcPr/>
+          <w:p>
+            <w:pPr>
+              <w:pStyle w:val="Compact"/>
+            </w:pPr>
+            <w:r>
+              <w:rPr>
+                <w:rStyle w:val="VerbatimChar"/>
+              </w:rPr>
+              <w:t xml:space="preserve">amount_units</w:t>
+            </w:r>
+          </w:p>
+        </w:tc>
+        <w:tc>
+          <w:tcPr/>
+          <w:p>
+            <w:pPr>
+              <w:pStyle w:val="Compact"/>
+            </w:pPr>
+            <w:r>
+              <w:t xml:space="preserve">millions</w:t>
+            </w:r>
+          </w:p>
+        </w:tc>
+        <w:tc>
+          <w:tcPr/>
+          <w:p>
+            <w:pPr>
+              <w:pStyle w:val="Compact"/>
+            </w:pPr>
+            <w:r>
+              <w:t xml:space="preserve">no</w:t>
+            </w:r>
+          </w:p>
+        </w:tc>
+        <w:tc>
+          <w:tcPr/>
+          <w:p>
+            <w:pPr>
+              <w:pStyle w:val="Compact"/>
+            </w:pPr>
+            <w:r>
+              <w:t xml:space="preserve">labels the scale of the figures, e.g. millions</w:t>
             </w:r>
           </w:p>
         </w:tc>

</xml_diff>

<commit_message>
List general inputs first in the docs to match the tool
The general inputs sheet is now the first Excel tab and the first item on the
Data step, so describe it first in the input-format section and the README, and
mention it in the Data step row. Regenerate the Word copy.

Co-Authored-By: Claude Opus 4.8 <noreply@anthropic.com>
</commit_message>
<xml_diff>
--- a/Technical documentation.docx
+++ b/Technical documentation.docx
@@ -475,7 +475,7 @@
               <w:pStyle w:val="Compact"/>
             </w:pPr>
             <w:r>
-              <w:t xml:space="preserve">Upload the workbook and review the losses, exposure and inflation that loaded.</w:t>
+              <w:t xml:space="preserve">Upload the workbook and review the general inputs, losses, exposure and inflation that loaded.</w:t>
             </w:r>
           </w:p>
         </w:tc>
@@ -1555,529 +1555,6 @@
         <w:t xml:space="preserve">in the workbook; it is defined in the dashboard.</w:t>
       </w:r>
     </w:p>
-    <w:p>
-      <w:pPr>
-        <w:pStyle w:val="BodyText"/>
-      </w:pPr>
-      <w:r>
-        <w:rPr>
-          <w:b/>
-          <w:bCs/>
-        </w:rPr>
-        <w:t xml:space="preserve">Sheet</w:t>
-      </w:r>
-      <w:r>
-        <w:rPr>
-          <w:b/>
-          <w:bCs/>
-        </w:rPr>
-        <w:t xml:space="preserve"> </w:t>
-      </w:r>
-      <w:r>
-        <w:rPr>
-          <w:rStyle w:val="VerbatimChar"/>
-          <w:b/>
-          <w:bCs/>
-        </w:rPr>
-        <w:t xml:space="preserve">losses</w:t>
-      </w:r>
-      <w:r>
-        <w:t xml:space="preserve"> </w:t>
-      </w:r>
-      <w:r>
-        <w:t xml:space="preserve">(one row per individual loss):</w:t>
-      </w:r>
-    </w:p>
-    <w:tbl>
-      <w:tblPr>
-        <w:tblStyle w:val="Table"/>
-        <w:tblW w:type="auto" w:w="0"/>
-        <w:tblLook w:firstRow="1" w:lastRow="0" w:firstColumn="0" w:lastColumn="0" w:noHBand="0" w:noVBand="0" w:val="0020"/>
-      </w:tblPr>
-      <w:tblGrid>
-        <w:gridCol w:w="2640"/>
-        <w:gridCol w:w="2640"/>
-        <w:gridCol w:w="2640"/>
-      </w:tblGrid>
-      <w:tr>
-        <w:trPr>
-          <w:tblHeader w:val="on"/>
-        </w:trPr>
-        <w:tc>
-          <w:tcPr/>
-          <w:p>
-            <w:pPr>
-              <w:pStyle w:val="Compact"/>
-            </w:pPr>
-            <w:r>
-              <w:t xml:space="preserve">column</w:t>
-            </w:r>
-          </w:p>
-        </w:tc>
-        <w:tc>
-          <w:tcPr/>
-          <w:p>
-            <w:pPr>
-              <w:pStyle w:val="Compact"/>
-            </w:pPr>
-            <w:r>
-              <w:t xml:space="preserve">type</w:t>
-            </w:r>
-          </w:p>
-        </w:tc>
-        <w:tc>
-          <w:tcPr/>
-          <w:p>
-            <w:pPr>
-              <w:pStyle w:val="Compact"/>
-            </w:pPr>
-            <w:r>
-              <w:t xml:space="preserve">notes</w:t>
-            </w:r>
-          </w:p>
-        </w:tc>
-      </w:tr>
-      <w:tr>
-        <w:tc>
-          <w:tcPr/>
-          <w:p>
-            <w:pPr>
-              <w:pStyle w:val="Compact"/>
-            </w:pPr>
-            <w:r>
-              <w:rPr>
-                <w:rStyle w:val="VerbatimChar"/>
-              </w:rPr>
-              <w:t xml:space="preserve">year</w:t>
-            </w:r>
-          </w:p>
-        </w:tc>
-        <w:tc>
-          <w:tcPr/>
-          <w:p>
-            <w:pPr>
-              <w:pStyle w:val="Compact"/>
-            </w:pPr>
-            <w:r>
-              <w:t xml:space="preserve">integer</w:t>
-            </w:r>
-          </w:p>
-        </w:tc>
-        <w:tc>
-          <w:tcPr/>
-          <w:p>
-            <w:pPr>
-              <w:pStyle w:val="Compact"/>
-            </w:pPr>
-            <w:r>
-              <w:t xml:space="preserve">accident or occurrence year</w:t>
-            </w:r>
-          </w:p>
-        </w:tc>
-      </w:tr>
-      <w:tr>
-        <w:tc>
-          <w:tcPr/>
-          <w:p>
-            <w:pPr>
-              <w:pStyle w:val="Compact"/>
-            </w:pPr>
-            <w:r>
-              <w:rPr>
-                <w:rStyle w:val="VerbatimChar"/>
-              </w:rPr>
-              <w:t xml:space="preserve">loss</w:t>
-            </w:r>
-          </w:p>
-        </w:tc>
-        <w:tc>
-          <w:tcPr/>
-          <w:p>
-            <w:pPr>
-              <w:pStyle w:val="Compact"/>
-            </w:pPr>
-            <w:r>
-              <w:t xml:space="preserve">numeric</w:t>
-            </w:r>
-          </w:p>
-        </w:tc>
-        <w:tc>
-          <w:tcPr/>
-          <w:p>
-            <w:pPr>
-              <w:pStyle w:val="Compact"/>
-            </w:pPr>
-            <w:r>
-              <w:t xml:space="preserve">ground-up loss amount</w:t>
-            </w:r>
-          </w:p>
-        </w:tc>
-      </w:tr>
-      <w:tr>
-        <w:tc>
-          <w:tcPr/>
-          <w:p>
-            <w:pPr>
-              <w:pStyle w:val="Compact"/>
-            </w:pPr>
-            <w:r>
-              <w:rPr>
-                <w:rStyle w:val="VerbatimChar"/>
-              </w:rPr>
-              <w:t xml:space="preserve">line_of_business</w:t>
-            </w:r>
-          </w:p>
-        </w:tc>
-        <w:tc>
-          <w:tcPr/>
-          <w:p>
-            <w:pPr>
-              <w:pStyle w:val="Compact"/>
-            </w:pPr>
-            <w:r>
-              <w:t xml:space="preserve">text</w:t>
-            </w:r>
-          </w:p>
-        </w:tc>
-        <w:tc>
-          <w:tcPr/>
-          <w:p>
-            <w:pPr>
-              <w:pStyle w:val="Compact"/>
-            </w:pPr>
-            <w:r>
-              <w:t xml:space="preserve">optional, informational</w:t>
-            </w:r>
-          </w:p>
-        </w:tc>
-      </w:tr>
-    </w:tbl>
-    <w:p>
-      <w:pPr>
-        <w:pStyle w:val="BodyText"/>
-      </w:pPr>
-      <w:r>
-        <w:rPr>
-          <w:b/>
-          <w:bCs/>
-        </w:rPr>
-        <w:t xml:space="preserve">Sheet</w:t>
-      </w:r>
-      <w:r>
-        <w:rPr>
-          <w:b/>
-          <w:bCs/>
-        </w:rPr>
-        <w:t xml:space="preserve"> </w:t>
-      </w:r>
-      <w:r>
-        <w:rPr>
-          <w:rStyle w:val="VerbatimChar"/>
-          <w:b/>
-          <w:bCs/>
-        </w:rPr>
-        <w:t xml:space="preserve">exposure</w:t>
-      </w:r>
-      <w:r>
-        <w:t xml:space="preserve"> </w:t>
-      </w:r>
-      <w:r>
-        <w:t xml:space="preserve">(one row per year, including the prospective valuation</w:t>
-      </w:r>
-      <w:r>
-        <w:t xml:space="preserve"> </w:t>
-      </w:r>
-      <w:r>
-        <w:t xml:space="preserve">year):</w:t>
-      </w:r>
-    </w:p>
-    <w:tbl>
-      <w:tblPr>
-        <w:tblStyle w:val="Table"/>
-        <w:tblW w:type="pct" w:w="5000"/>
-        <w:tblLayout w:type="fixed"/>
-        <w:tblLook w:firstRow="1" w:lastRow="0" w:firstColumn="0" w:lastColumn="0" w:noHBand="0" w:noVBand="0" w:val="0020"/>
-      </w:tblPr>
-      <w:tblGrid>
-        <w:gridCol w:w="3017"/>
-        <w:gridCol w:w="2262"/>
-        <w:gridCol w:w="2640"/>
-      </w:tblGrid>
-      <w:tr>
-        <w:trPr>
-          <w:tblHeader w:val="on"/>
-        </w:trPr>
-        <w:tc>
-          <w:tcPr/>
-          <w:p>
-            <w:pPr>
-              <w:pStyle w:val="Compact"/>
-            </w:pPr>
-            <w:r>
-              <w:t xml:space="preserve">column</w:t>
-            </w:r>
-          </w:p>
-        </w:tc>
-        <w:tc>
-          <w:tcPr/>
-          <w:p>
-            <w:pPr>
-              <w:pStyle w:val="Compact"/>
-            </w:pPr>
-            <w:r>
-              <w:t xml:space="preserve">type</w:t>
-            </w:r>
-          </w:p>
-        </w:tc>
-        <w:tc>
-          <w:tcPr/>
-          <w:p>
-            <w:pPr>
-              <w:pStyle w:val="Compact"/>
-            </w:pPr>
-            <w:r>
-              <w:t xml:space="preserve">notes</w:t>
-            </w:r>
-          </w:p>
-        </w:tc>
-      </w:tr>
-      <w:tr>
-        <w:tc>
-          <w:tcPr/>
-          <w:p>
-            <w:pPr>
-              <w:pStyle w:val="Compact"/>
-            </w:pPr>
-            <w:r>
-              <w:rPr>
-                <w:rStyle w:val="VerbatimChar"/>
-              </w:rPr>
-              <w:t xml:space="preserve">year</w:t>
-            </w:r>
-          </w:p>
-        </w:tc>
-        <w:tc>
-          <w:tcPr/>
-          <w:p>
-            <w:pPr>
-              <w:pStyle w:val="Compact"/>
-            </w:pPr>
-            <w:r>
-              <w:t xml:space="preserve">integer</w:t>
-            </w:r>
-          </w:p>
-        </w:tc>
-        <w:tc>
-          <w:tcPr/>
-          <w:p>
-            <w:pPr>
-              <w:pStyle w:val="Compact"/>
-            </w:pPr>
-          </w:p>
-        </w:tc>
-      </w:tr>
-      <w:tr>
-        <w:tc>
-          <w:tcPr/>
-          <w:p>
-            <w:pPr>
-              <w:pStyle w:val="Compact"/>
-            </w:pPr>
-            <w:r>
-              <w:rPr>
-                <w:rStyle w:val="VerbatimChar"/>
-              </w:rPr>
-              <w:t xml:space="preserve">exposure</w:t>
-            </w:r>
-          </w:p>
-        </w:tc>
-        <w:tc>
-          <w:tcPr/>
-          <w:p>
-            <w:pPr>
-              <w:pStyle w:val="Compact"/>
-            </w:pPr>
-            <w:r>
-              <w:t xml:space="preserve">numeric</w:t>
-            </w:r>
-          </w:p>
-        </w:tc>
-        <w:tc>
-          <w:tcPr/>
-          <w:p>
-            <w:pPr>
-              <w:pStyle w:val="Compact"/>
-            </w:pPr>
-            <w:r>
-              <w:t xml:space="preserve">exposure measure, for example number of risks or sum insured</w:t>
-            </w:r>
-          </w:p>
-        </w:tc>
-      </w:tr>
-    </w:tbl>
-    <w:p>
-      <w:pPr>
-        <w:pStyle w:val="BodyText"/>
-      </w:pPr>
-      <w:r>
-        <w:rPr>
-          <w:b/>
-          <w:bCs/>
-        </w:rPr>
-        <w:t xml:space="preserve">Sheet</w:t>
-      </w:r>
-      <w:r>
-        <w:rPr>
-          <w:b/>
-          <w:bCs/>
-        </w:rPr>
-        <w:t xml:space="preserve"> </w:t>
-      </w:r>
-      <w:r>
-        <w:rPr>
-          <w:rStyle w:val="VerbatimChar"/>
-          <w:b/>
-          <w:bCs/>
-        </w:rPr>
-        <w:t xml:space="preserve">inflation</w:t>
-      </w:r>
-      <w:r>
-        <w:t xml:space="preserve"> </w:t>
-      </w:r>
-      <w:r>
-        <w:t xml:space="preserve">(loss inflation is a per-year rate, not a single</w:t>
-      </w:r>
-      <w:r>
-        <w:t xml:space="preserve"> </w:t>
-      </w:r>
-      <w:r>
-        <w:t xml:space="preserve">constant):</w:t>
-      </w:r>
-    </w:p>
-    <w:tbl>
-      <w:tblPr>
-        <w:tblStyle w:val="Table"/>
-        <w:tblW w:type="pct" w:w="5000"/>
-        <w:tblLayout w:type="fixed"/>
-        <w:tblLook w:firstRow="1" w:lastRow="0" w:firstColumn="0" w:lastColumn="0" w:noHBand="0" w:noVBand="0" w:val="0020"/>
-      </w:tblPr>
-      <w:tblGrid>
-        <w:gridCol w:w="3017"/>
-        <w:gridCol w:w="2262"/>
-        <w:gridCol w:w="2640"/>
-      </w:tblGrid>
-      <w:tr>
-        <w:trPr>
-          <w:tblHeader w:val="on"/>
-        </w:trPr>
-        <w:tc>
-          <w:tcPr/>
-          <w:p>
-            <w:pPr>
-              <w:pStyle w:val="Compact"/>
-            </w:pPr>
-            <w:r>
-              <w:t xml:space="preserve">column</w:t>
-            </w:r>
-          </w:p>
-        </w:tc>
-        <w:tc>
-          <w:tcPr/>
-          <w:p>
-            <w:pPr>
-              <w:pStyle w:val="Compact"/>
-            </w:pPr>
-            <w:r>
-              <w:t xml:space="preserve">type</w:t>
-            </w:r>
-          </w:p>
-        </w:tc>
-        <w:tc>
-          <w:tcPr/>
-          <w:p>
-            <w:pPr>
-              <w:pStyle w:val="Compact"/>
-            </w:pPr>
-            <w:r>
-              <w:t xml:space="preserve">notes</w:t>
-            </w:r>
-          </w:p>
-        </w:tc>
-      </w:tr>
-      <w:tr>
-        <w:tc>
-          <w:tcPr/>
-          <w:p>
-            <w:pPr>
-              <w:pStyle w:val="Compact"/>
-            </w:pPr>
-            <w:r>
-              <w:rPr>
-                <w:rStyle w:val="VerbatimChar"/>
-              </w:rPr>
-              <w:t xml:space="preserve">year</w:t>
-            </w:r>
-          </w:p>
-        </w:tc>
-        <w:tc>
-          <w:tcPr/>
-          <w:p>
-            <w:pPr>
-              <w:pStyle w:val="Compact"/>
-            </w:pPr>
-            <w:r>
-              <w:t xml:space="preserve">integer</w:t>
-            </w:r>
-          </w:p>
-        </w:tc>
-        <w:tc>
-          <w:tcPr/>
-          <w:p>
-            <w:pPr>
-              <w:pStyle w:val="Compact"/>
-            </w:pPr>
-          </w:p>
-        </w:tc>
-      </w:tr>
-      <w:tr>
-        <w:tc>
-          <w:tcPr/>
-          <w:p>
-            <w:pPr>
-              <w:pStyle w:val="Compact"/>
-            </w:pPr>
-            <w:r>
-              <w:rPr>
-                <w:rStyle w:val="VerbatimChar"/>
-              </w:rPr>
-              <w:t xml:space="preserve">inflation</w:t>
-            </w:r>
-          </w:p>
-        </w:tc>
-        <w:tc>
-          <w:tcPr/>
-          <w:p>
-            <w:pPr>
-              <w:pStyle w:val="Compact"/>
-            </w:pPr>
-            <w:r>
-              <w:t xml:space="preserve">numeric</w:t>
-            </w:r>
-          </w:p>
-        </w:tc>
-        <w:tc>
-          <w:tcPr/>
-          <w:p>
-            <w:pPr>
-              <w:pStyle w:val="Compact"/>
-            </w:pPr>
-            <w:r>
-              <w:t xml:space="preserve">loss inflation during that year, for example 0.03 for 3%</w:t>
-            </w:r>
-          </w:p>
-        </w:tc>
-      </w:tr>
-    </w:tbl>
     <w:p>
       <w:pPr>
         <w:pStyle w:val="BodyText"/>
@@ -2413,6 +1890,529 @@
         <w:t xml:space="preserve">raise it.</w:t>
       </w:r>
     </w:p>
+    <w:p>
+      <w:pPr>
+        <w:pStyle w:val="BodyText"/>
+      </w:pPr>
+      <w:r>
+        <w:rPr>
+          <w:b/>
+          <w:bCs/>
+        </w:rPr>
+        <w:t xml:space="preserve">Sheet</w:t>
+      </w:r>
+      <w:r>
+        <w:rPr>
+          <w:b/>
+          <w:bCs/>
+        </w:rPr>
+        <w:t xml:space="preserve"> </w:t>
+      </w:r>
+      <w:r>
+        <w:rPr>
+          <w:rStyle w:val="VerbatimChar"/>
+          <w:b/>
+          <w:bCs/>
+        </w:rPr>
+        <w:t xml:space="preserve">losses</w:t>
+      </w:r>
+      <w:r>
+        <w:t xml:space="preserve"> </w:t>
+      </w:r>
+      <w:r>
+        <w:t xml:space="preserve">(one row per individual loss):</w:t>
+      </w:r>
+    </w:p>
+    <w:tbl>
+      <w:tblPr>
+        <w:tblStyle w:val="Table"/>
+        <w:tblW w:type="auto" w:w="0"/>
+        <w:tblLook w:firstRow="1" w:lastRow="0" w:firstColumn="0" w:lastColumn="0" w:noHBand="0" w:noVBand="0" w:val="0020"/>
+      </w:tblPr>
+      <w:tblGrid>
+        <w:gridCol w:w="2640"/>
+        <w:gridCol w:w="2640"/>
+        <w:gridCol w:w="2640"/>
+      </w:tblGrid>
+      <w:tr>
+        <w:trPr>
+          <w:tblHeader w:val="on"/>
+        </w:trPr>
+        <w:tc>
+          <w:tcPr/>
+          <w:p>
+            <w:pPr>
+              <w:pStyle w:val="Compact"/>
+            </w:pPr>
+            <w:r>
+              <w:t xml:space="preserve">column</w:t>
+            </w:r>
+          </w:p>
+        </w:tc>
+        <w:tc>
+          <w:tcPr/>
+          <w:p>
+            <w:pPr>
+              <w:pStyle w:val="Compact"/>
+            </w:pPr>
+            <w:r>
+              <w:t xml:space="preserve">type</w:t>
+            </w:r>
+          </w:p>
+        </w:tc>
+        <w:tc>
+          <w:tcPr/>
+          <w:p>
+            <w:pPr>
+              <w:pStyle w:val="Compact"/>
+            </w:pPr>
+            <w:r>
+              <w:t xml:space="preserve">notes</w:t>
+            </w:r>
+          </w:p>
+        </w:tc>
+      </w:tr>
+      <w:tr>
+        <w:tc>
+          <w:tcPr/>
+          <w:p>
+            <w:pPr>
+              <w:pStyle w:val="Compact"/>
+            </w:pPr>
+            <w:r>
+              <w:rPr>
+                <w:rStyle w:val="VerbatimChar"/>
+              </w:rPr>
+              <w:t xml:space="preserve">year</w:t>
+            </w:r>
+          </w:p>
+        </w:tc>
+        <w:tc>
+          <w:tcPr/>
+          <w:p>
+            <w:pPr>
+              <w:pStyle w:val="Compact"/>
+            </w:pPr>
+            <w:r>
+              <w:t xml:space="preserve">integer</w:t>
+            </w:r>
+          </w:p>
+        </w:tc>
+        <w:tc>
+          <w:tcPr/>
+          <w:p>
+            <w:pPr>
+              <w:pStyle w:val="Compact"/>
+            </w:pPr>
+            <w:r>
+              <w:t xml:space="preserve">accident or occurrence year</w:t>
+            </w:r>
+          </w:p>
+        </w:tc>
+      </w:tr>
+      <w:tr>
+        <w:tc>
+          <w:tcPr/>
+          <w:p>
+            <w:pPr>
+              <w:pStyle w:val="Compact"/>
+            </w:pPr>
+            <w:r>
+              <w:rPr>
+                <w:rStyle w:val="VerbatimChar"/>
+              </w:rPr>
+              <w:t xml:space="preserve">loss</w:t>
+            </w:r>
+          </w:p>
+        </w:tc>
+        <w:tc>
+          <w:tcPr/>
+          <w:p>
+            <w:pPr>
+              <w:pStyle w:val="Compact"/>
+            </w:pPr>
+            <w:r>
+              <w:t xml:space="preserve">numeric</w:t>
+            </w:r>
+          </w:p>
+        </w:tc>
+        <w:tc>
+          <w:tcPr/>
+          <w:p>
+            <w:pPr>
+              <w:pStyle w:val="Compact"/>
+            </w:pPr>
+            <w:r>
+              <w:t xml:space="preserve">ground-up loss amount</w:t>
+            </w:r>
+          </w:p>
+        </w:tc>
+      </w:tr>
+      <w:tr>
+        <w:tc>
+          <w:tcPr/>
+          <w:p>
+            <w:pPr>
+              <w:pStyle w:val="Compact"/>
+            </w:pPr>
+            <w:r>
+              <w:rPr>
+                <w:rStyle w:val="VerbatimChar"/>
+              </w:rPr>
+              <w:t xml:space="preserve">line_of_business</w:t>
+            </w:r>
+          </w:p>
+        </w:tc>
+        <w:tc>
+          <w:tcPr/>
+          <w:p>
+            <w:pPr>
+              <w:pStyle w:val="Compact"/>
+            </w:pPr>
+            <w:r>
+              <w:t xml:space="preserve">text</w:t>
+            </w:r>
+          </w:p>
+        </w:tc>
+        <w:tc>
+          <w:tcPr/>
+          <w:p>
+            <w:pPr>
+              <w:pStyle w:val="Compact"/>
+            </w:pPr>
+            <w:r>
+              <w:t xml:space="preserve">optional, informational</w:t>
+            </w:r>
+          </w:p>
+        </w:tc>
+      </w:tr>
+    </w:tbl>
+    <w:p>
+      <w:pPr>
+        <w:pStyle w:val="BodyText"/>
+      </w:pPr>
+      <w:r>
+        <w:rPr>
+          <w:b/>
+          <w:bCs/>
+        </w:rPr>
+        <w:t xml:space="preserve">Sheet</w:t>
+      </w:r>
+      <w:r>
+        <w:rPr>
+          <w:b/>
+          <w:bCs/>
+        </w:rPr>
+        <w:t xml:space="preserve"> </w:t>
+      </w:r>
+      <w:r>
+        <w:rPr>
+          <w:rStyle w:val="VerbatimChar"/>
+          <w:b/>
+          <w:bCs/>
+        </w:rPr>
+        <w:t xml:space="preserve">exposure</w:t>
+      </w:r>
+      <w:r>
+        <w:t xml:space="preserve"> </w:t>
+      </w:r>
+      <w:r>
+        <w:t xml:space="preserve">(one row per year, including the prospective valuation</w:t>
+      </w:r>
+      <w:r>
+        <w:t xml:space="preserve"> </w:t>
+      </w:r>
+      <w:r>
+        <w:t xml:space="preserve">year):</w:t>
+      </w:r>
+    </w:p>
+    <w:tbl>
+      <w:tblPr>
+        <w:tblStyle w:val="Table"/>
+        <w:tblW w:type="pct" w:w="5000"/>
+        <w:tblLayout w:type="fixed"/>
+        <w:tblLook w:firstRow="1" w:lastRow="0" w:firstColumn="0" w:lastColumn="0" w:noHBand="0" w:noVBand="0" w:val="0020"/>
+      </w:tblPr>
+      <w:tblGrid>
+        <w:gridCol w:w="3017"/>
+        <w:gridCol w:w="2262"/>
+        <w:gridCol w:w="2640"/>
+      </w:tblGrid>
+      <w:tr>
+        <w:trPr>
+          <w:tblHeader w:val="on"/>
+        </w:trPr>
+        <w:tc>
+          <w:tcPr/>
+          <w:p>
+            <w:pPr>
+              <w:pStyle w:val="Compact"/>
+            </w:pPr>
+            <w:r>
+              <w:t xml:space="preserve">column</w:t>
+            </w:r>
+          </w:p>
+        </w:tc>
+        <w:tc>
+          <w:tcPr/>
+          <w:p>
+            <w:pPr>
+              <w:pStyle w:val="Compact"/>
+            </w:pPr>
+            <w:r>
+              <w:t xml:space="preserve">type</w:t>
+            </w:r>
+          </w:p>
+        </w:tc>
+        <w:tc>
+          <w:tcPr/>
+          <w:p>
+            <w:pPr>
+              <w:pStyle w:val="Compact"/>
+            </w:pPr>
+            <w:r>
+              <w:t xml:space="preserve">notes</w:t>
+            </w:r>
+          </w:p>
+        </w:tc>
+      </w:tr>
+      <w:tr>
+        <w:tc>
+          <w:tcPr/>
+          <w:p>
+            <w:pPr>
+              <w:pStyle w:val="Compact"/>
+            </w:pPr>
+            <w:r>
+              <w:rPr>
+                <w:rStyle w:val="VerbatimChar"/>
+              </w:rPr>
+              <w:t xml:space="preserve">year</w:t>
+            </w:r>
+          </w:p>
+        </w:tc>
+        <w:tc>
+          <w:tcPr/>
+          <w:p>
+            <w:pPr>
+              <w:pStyle w:val="Compact"/>
+            </w:pPr>
+            <w:r>
+              <w:t xml:space="preserve">integer</w:t>
+            </w:r>
+          </w:p>
+        </w:tc>
+        <w:tc>
+          <w:tcPr/>
+          <w:p>
+            <w:pPr>
+              <w:pStyle w:val="Compact"/>
+            </w:pPr>
+          </w:p>
+        </w:tc>
+      </w:tr>
+      <w:tr>
+        <w:tc>
+          <w:tcPr/>
+          <w:p>
+            <w:pPr>
+              <w:pStyle w:val="Compact"/>
+            </w:pPr>
+            <w:r>
+              <w:rPr>
+                <w:rStyle w:val="VerbatimChar"/>
+              </w:rPr>
+              <w:t xml:space="preserve">exposure</w:t>
+            </w:r>
+          </w:p>
+        </w:tc>
+        <w:tc>
+          <w:tcPr/>
+          <w:p>
+            <w:pPr>
+              <w:pStyle w:val="Compact"/>
+            </w:pPr>
+            <w:r>
+              <w:t xml:space="preserve">numeric</w:t>
+            </w:r>
+          </w:p>
+        </w:tc>
+        <w:tc>
+          <w:tcPr/>
+          <w:p>
+            <w:pPr>
+              <w:pStyle w:val="Compact"/>
+            </w:pPr>
+            <w:r>
+              <w:t xml:space="preserve">exposure measure, for example number of risks or sum insured</w:t>
+            </w:r>
+          </w:p>
+        </w:tc>
+      </w:tr>
+    </w:tbl>
+    <w:p>
+      <w:pPr>
+        <w:pStyle w:val="BodyText"/>
+      </w:pPr>
+      <w:r>
+        <w:rPr>
+          <w:b/>
+          <w:bCs/>
+        </w:rPr>
+        <w:t xml:space="preserve">Sheet</w:t>
+      </w:r>
+      <w:r>
+        <w:rPr>
+          <w:b/>
+          <w:bCs/>
+        </w:rPr>
+        <w:t xml:space="preserve"> </w:t>
+      </w:r>
+      <w:r>
+        <w:rPr>
+          <w:rStyle w:val="VerbatimChar"/>
+          <w:b/>
+          <w:bCs/>
+        </w:rPr>
+        <w:t xml:space="preserve">inflation</w:t>
+      </w:r>
+      <w:r>
+        <w:t xml:space="preserve"> </w:t>
+      </w:r>
+      <w:r>
+        <w:t xml:space="preserve">(loss inflation is a per-year rate, not a single</w:t>
+      </w:r>
+      <w:r>
+        <w:t xml:space="preserve"> </w:t>
+      </w:r>
+      <w:r>
+        <w:t xml:space="preserve">constant):</w:t>
+      </w:r>
+    </w:p>
+    <w:tbl>
+      <w:tblPr>
+        <w:tblStyle w:val="Table"/>
+        <w:tblW w:type="pct" w:w="5000"/>
+        <w:tblLayout w:type="fixed"/>
+        <w:tblLook w:firstRow="1" w:lastRow="0" w:firstColumn="0" w:lastColumn="0" w:noHBand="0" w:noVBand="0" w:val="0020"/>
+      </w:tblPr>
+      <w:tblGrid>
+        <w:gridCol w:w="3017"/>
+        <w:gridCol w:w="2262"/>
+        <w:gridCol w:w="2640"/>
+      </w:tblGrid>
+      <w:tr>
+        <w:trPr>
+          <w:tblHeader w:val="on"/>
+        </w:trPr>
+        <w:tc>
+          <w:tcPr/>
+          <w:p>
+            <w:pPr>
+              <w:pStyle w:val="Compact"/>
+            </w:pPr>
+            <w:r>
+              <w:t xml:space="preserve">column</w:t>
+            </w:r>
+          </w:p>
+        </w:tc>
+        <w:tc>
+          <w:tcPr/>
+          <w:p>
+            <w:pPr>
+              <w:pStyle w:val="Compact"/>
+            </w:pPr>
+            <w:r>
+              <w:t xml:space="preserve">type</w:t>
+            </w:r>
+          </w:p>
+        </w:tc>
+        <w:tc>
+          <w:tcPr/>
+          <w:p>
+            <w:pPr>
+              <w:pStyle w:val="Compact"/>
+            </w:pPr>
+            <w:r>
+              <w:t xml:space="preserve">notes</w:t>
+            </w:r>
+          </w:p>
+        </w:tc>
+      </w:tr>
+      <w:tr>
+        <w:tc>
+          <w:tcPr/>
+          <w:p>
+            <w:pPr>
+              <w:pStyle w:val="Compact"/>
+            </w:pPr>
+            <w:r>
+              <w:rPr>
+                <w:rStyle w:val="VerbatimChar"/>
+              </w:rPr>
+              <w:t xml:space="preserve">year</w:t>
+            </w:r>
+          </w:p>
+        </w:tc>
+        <w:tc>
+          <w:tcPr/>
+          <w:p>
+            <w:pPr>
+              <w:pStyle w:val="Compact"/>
+            </w:pPr>
+            <w:r>
+              <w:t xml:space="preserve">integer</w:t>
+            </w:r>
+          </w:p>
+        </w:tc>
+        <w:tc>
+          <w:tcPr/>
+          <w:p>
+            <w:pPr>
+              <w:pStyle w:val="Compact"/>
+            </w:pPr>
+          </w:p>
+        </w:tc>
+      </w:tr>
+      <w:tr>
+        <w:tc>
+          <w:tcPr/>
+          <w:p>
+            <w:pPr>
+              <w:pStyle w:val="Compact"/>
+            </w:pPr>
+            <w:r>
+              <w:rPr>
+                <w:rStyle w:val="VerbatimChar"/>
+              </w:rPr>
+              <w:t xml:space="preserve">inflation</w:t>
+            </w:r>
+          </w:p>
+        </w:tc>
+        <w:tc>
+          <w:tcPr/>
+          <w:p>
+            <w:pPr>
+              <w:pStyle w:val="Compact"/>
+            </w:pPr>
+            <w:r>
+              <w:t xml:space="preserve">numeric</w:t>
+            </w:r>
+          </w:p>
+        </w:tc>
+        <w:tc>
+          <w:tcPr/>
+          <w:p>
+            <w:pPr>
+              <w:pStyle w:val="Compact"/>
+            </w:pPr>
+            <w:r>
+              <w:t xml:space="preserve">loss inflation during that year, for example 0.03 for 3%</w:t>
+            </w:r>
+          </w:p>
+        </w:tc>
+      </w:tr>
+    </w:tbl>
     <w:bookmarkEnd w:id="27"/>
     <w:bookmarkStart w:id="28" w:name="output"/>
     <w:p>

</xml_diff>

<commit_message>
Split the Model step into frequency and severity cards
Separate the two calibrations on the Model step into stacked cards
with a shared modelling threshold on top, give them a subtle blue
tint, and keep the severity plot panel white so the fit stays clear.
Force the severity y-axis to 0..1 and thicken the legend lines.

Make the modelling threshold inclusive so the default (smallest loss)
includes every loss: filter losses with >= in fit_frequency and
fit_severity and in the live plot, with tests for the boundary case.

Co-Authored-By: Claude Opus 4.8 <noreply@anthropic.com>
</commit_message>
<xml_diff>
--- a/Technical documentation.docx
+++ b/Technical documentation.docx
@@ -1887,7 +1887,13 @@
         <w:t xml:space="preserve"> </w:t>
       </w:r>
       <w:r>
-        <w:t xml:space="preserve">raise it.</w:t>
+        <w:t xml:space="preserve">raise it. The threshold is inclusive: losses exactly at the modelling threshold</w:t>
+      </w:r>
+      <w:r>
+        <w:t xml:space="preserve"> </w:t>
+      </w:r>
+      <w:r>
+        <w:t xml:space="preserve">are modelled, and only smaller losses are ignored.</w:t>
       </w:r>
     </w:p>
     <w:p>

</xml_diff>

<commit_message>
Rework the modelling threshold and guard the severity body
Three related changes to the severity/threshold modelling:

- Make the modelling threshold strict (losses are modelled above it, not at
  it) and fix the kink/point-mass that appeared when the splice sat on the
  threshold.

- Bring back the reporting threshold as a required general input (Excel
  template, reader, Data step display, docs) and default the modelling
  threshold to it, so the model starts where the data becomes reliable.

- Warn (non-blocking) when the splice is raised so the lognormal body is
  fitted on too few losses, nudging back to the single-Pareto default; the
  body stays an opt-in refinement.

Co-Authored-By: Claude Opus 4.8 <noreply@anthropic.com>
</commit_message>
<xml_diff>
--- a/Technical documentation.docx
+++ b/Technical documentation.docx
@@ -1731,6 +1731,55 @@
               <w:rPr>
                 <w:rStyle w:val="VerbatimChar"/>
               </w:rPr>
+              <w:t xml:space="preserve">reporting_threshold</w:t>
+            </w:r>
+          </w:p>
+        </w:tc>
+        <w:tc>
+          <w:tcPr/>
+          <w:p>
+            <w:pPr>
+              <w:pStyle w:val="Compact"/>
+            </w:pPr>
+            <w:r>
+              <w:t xml:space="preserve">2</w:t>
+            </w:r>
+          </w:p>
+        </w:tc>
+        <w:tc>
+          <w:tcPr/>
+          <w:p>
+            <w:pPr>
+              <w:pStyle w:val="Compact"/>
+            </w:pPr>
+            <w:r>
+              <w:t xml:space="preserve">yes</w:t>
+            </w:r>
+          </w:p>
+        </w:tc>
+        <w:tc>
+          <w:tcPr/>
+          <w:p>
+            <w:pPr>
+              <w:pStyle w:val="Compact"/>
+            </w:pPr>
+            <w:r>
+              <w:t xml:space="preserve">the loss size above which the data is complete; it bounds the modelling threshold from below</w:t>
+            </w:r>
+          </w:p>
+        </w:tc>
+      </w:tr>
+      <w:tr>
+        <w:tc>
+          <w:tcPr/>
+          <w:p>
+            <w:pPr>
+              <w:pStyle w:val="Compact"/>
+            </w:pPr>
+            <w:r>
+              <w:rPr>
+                <w:rStyle w:val="VerbatimChar"/>
+              </w:rPr>
               <w:t xml:space="preserve">currency</w:t>
             </w:r>
           </w:p>
@@ -1869,31 +1918,31 @@
         <w:t xml:space="preserve">pipeline.R</w:t>
       </w:r>
       <w:r>
-        <w:t xml:space="preserve">). The modelling threshold has no fixed</w:t>
-      </w:r>
-      <w:r>
-        <w:t xml:space="preserve"> </w:t>
-      </w:r>
-      <w:r>
-        <w:t xml:space="preserve">built-in default: when neither the dashboard nor the workbook sets it, it starts</w:t>
-      </w:r>
-      <w:r>
-        <w:t xml:space="preserve"> </w:t>
-      </w:r>
-      <w:r>
-        <w:t xml:space="preserve">at the smallest loss in the history, so the model includes every loss until you</w:t>
-      </w:r>
-      <w:r>
-        <w:t xml:space="preserve"> </w:t>
-      </w:r>
-      <w:r>
-        <w:t xml:space="preserve">raise it. The threshold is inclusive: losses exactly at the modelling threshold</w:t>
-      </w:r>
-      <w:r>
-        <w:t xml:space="preserve"> </w:t>
-      </w:r>
-      <w:r>
-        <w:t xml:space="preserve">are modelled, and only smaller losses are ignored.</w:t>
+        <w:t xml:space="preserve">). When neither the dashboard nor the workbook</w:t>
+      </w:r>
+      <w:r>
+        <w:t xml:space="preserve"> </w:t>
+      </w:r>
+      <w:r>
+        <w:t xml:space="preserve">sets the modelling threshold, it defaults to the reporting threshold (the loss</w:t>
+      </w:r>
+      <w:r>
+        <w:t xml:space="preserve"> </w:t>
+      </w:r>
+      <w:r>
+        <w:t xml:space="preserve">size above which the data is complete), so the model starts exactly where the</w:t>
+      </w:r>
+      <w:r>
+        <w:t xml:space="preserve"> </w:t>
+      </w:r>
+      <w:r>
+        <w:t xml:space="preserve">data becomes reliable. The threshold is strict: only losses above it are</w:t>
+      </w:r>
+      <w:r>
+        <w:t xml:space="preserve"> </w:t>
+      </w:r>
+      <w:r>
+        <w:t xml:space="preserve">modelled.</w:t>
       </w:r>
     </w:p>
     <w:p>

</xml_diff>

<commit_message>
Put the reinsurance structure step before the model step
Reorder the guided flow to Data, Reinsurance structure, Model, Price so the
lowest deductible is known when the modelling threshold is chosen. Rename the
structure step to "Reinsurance structure", relabel the Back/Next buttons,
rewire the navigation, and update the docs.

Also adapt the severity parameters table to the chosen model: a single Pareto
shows just the tail index, while the spliced model also shows the lognormal
body and the tail weight.

Co-Authored-By: Claude Opus 4.8 <noreply@anthropic.com>
</commit_message>
<xml_diff>
--- a/Technical documentation.docx
+++ b/Technical documentation.docx
@@ -499,18 +499,18 @@
               <w:pStyle w:val="Compact"/>
             </w:pPr>
             <w:r>
-              <w:t xml:space="preserve">Model</w:t>
-            </w:r>
-          </w:p>
-        </w:tc>
-        <w:tc>
-          <w:tcPr/>
-          <w:p>
-            <w:pPr>
-              <w:pStyle w:val="Compact"/>
-            </w:pPr>
-            <w:r>
-              <w:t xml:space="preserve">Choose the modelling threshold, the splice threshold and the frequency model, while live plots show the fit.</w:t>
+              <w:t xml:space="preserve">Reinsurance structure</w:t>
+            </w:r>
+          </w:p>
+        </w:tc>
+        <w:tc>
+          <w:tcPr/>
+          <w:p>
+            <w:pPr>
+              <w:pStyle w:val="Compact"/>
+            </w:pPr>
+            <w:r>
+              <w:t xml:space="preserve">Define the reinsurance layers (deductible, cover, aggregate deductible, aggregate limit).</w:t>
             </w:r>
           </w:p>
         </w:tc>
@@ -534,18 +534,18 @@
               <w:pStyle w:val="Compact"/>
             </w:pPr>
             <w:r>
-              <w:t xml:space="preserve">Structure</w:t>
-            </w:r>
-          </w:p>
-        </w:tc>
-        <w:tc>
-          <w:tcPr/>
-          <w:p>
-            <w:pPr>
-              <w:pStyle w:val="Compact"/>
-            </w:pPr>
-            <w:r>
-              <w:t xml:space="preserve">Define the reinsurance layers (deductible, cover, aggregate deductible, aggregate limit).</w:t>
+              <w:t xml:space="preserve">Model</w:t>
+            </w:r>
+          </w:p>
+        </w:tc>
+        <w:tc>
+          <w:tcPr/>
+          <w:p>
+            <w:pPr>
+              <w:pStyle w:val="Compact"/>
+            </w:pPr>
+            <w:r>
+              <w:t xml:space="preserve">Choose the modelling threshold, the splice threshold and the frequency model, while live plots show the fit.</w:t>
             </w:r>
           </w:p>
         </w:tc>

</xml_diff>

<commit_message>
Mirror the dashboard structure across the price tables and Excel report
Reorder the structure step and the results and validation tables so cover
comes before the deductible and AAL before AAD, and group cover and
deductible under an each and every loss (EEL) header.

Blank the closed-form oracle for layers with aggregate conditions, since
AAD and AAL act on the annual aggregate and have no closed form, with a
note pointing the reader to the simulation.

Share one pair of report formatters (results_report, validation_report)
so the Excel results and validation sheets match the dashboard tables,
and name the downloaded workbook Pricing_LOB_year_timestamp.xlsx.

Co-Authored-By: Claude Opus 4.8 <noreply@anthropic.com>
</commit_message>
<xml_diff>
--- a/Technical documentation.docx
+++ b/Technical documentation.docx
@@ -7345,6 +7345,45 @@
       <w:r>
         <w:t xml:space="preserve">(AAD and AAL) and the volatility and tail metrics come from the simulation only.</w:t>
       </w:r>
+      <w:r>
+        <w:t xml:space="preserve"> </w:t>
+      </w:r>
+      <w:r>
+        <w:t xml:space="preserve">Because the oracle integrates a single loss, it has no closed form once a layer</w:t>
+      </w:r>
+      <w:r>
+        <w:t xml:space="preserve"> </w:t>
+      </w:r>
+      <w:r>
+        <w:t xml:space="preserve">carries an AAD or AAL, so for those layers the oracle is reported as</w:t>
+      </w:r>
+      <w:r>
+        <w:t xml:space="preserve"> </w:t>
+      </w:r>
+      <w:r>
+        <w:rPr>
+          <w:rStyle w:val="VerbatimChar"/>
+        </w:rPr>
+        <w:t xml:space="preserve">NA</w:t>
+      </w:r>
+      <w:r>
+        <w:t xml:space="preserve"> </w:t>
+      </w:r>
+      <w:r>
+        <w:t xml:space="preserve">(blank</w:t>
+      </w:r>
+      <w:r>
+        <w:t xml:space="preserve"> </w:t>
+      </w:r>
+      <w:r>
+        <w:t xml:space="preserve">in the dashboard, with a note that the simulation is the answer) rather than a</w:t>
+      </w:r>
+      <w:r>
+        <w:t xml:space="preserve"> </w:t>
+      </w:r>
+      <w:r>
+        <w:t xml:space="preserve">misleading per-loss figure.</w:t>
+      </w:r>
     </w:p>
     <w:p>
       <w:pPr>
@@ -7382,13 +7421,31 @@
         <w:t xml:space="preserve"> </w:t>
       </w:r>
       <w:r>
-        <w:t xml:space="preserve">had happened in the valuation year). Unlike the oracle, this carries no model, so</w:t>
-      </w:r>
-      <w:r>
-        <w:t xml:space="preserve"> </w:t>
-      </w:r>
-      <w:r>
-        <w:t xml:space="preserve">it is the external sense-check. Where the history is thick the modelled expected</w:t>
+        <w:t xml:space="preserve">had happened in the valuation year). Each historical year is layered per loss and</w:t>
+      </w:r>
+      <w:r>
+        <w:t xml:space="preserve"> </w:t>
+      </w:r>
+      <w:r>
+        <w:t xml:space="preserve">then run through the layer’s annual aggregate deductible and limit, so the</w:t>
+      </w:r>
+      <w:r>
+        <w:t xml:space="preserve"> </w:t>
+      </w:r>
+      <w:r>
+        <w:t xml:space="preserve">benchmark reflects the full layer terms (AAD and AAL included), the same way the</w:t>
+      </w:r>
+      <w:r>
+        <w:t xml:space="preserve"> </w:t>
+      </w:r>
+      <w:r>
+        <w:t xml:space="preserve">pricer does. Unlike the oracle, this carries no model, so it is the external</w:t>
+      </w:r>
+      <w:r>
+        <w:t xml:space="preserve"> </w:t>
+      </w:r>
+      <w:r>
+        <w:t xml:space="preserve">sense-check. Where the history is thick the modelled expected</w:t>
       </w:r>
       <w:r>
         <w:t xml:space="preserve"> </w:t>

</xml_diff>

<commit_message>
Scale frequency by exposure and trend severity by inflation only
Exposure is a volume measure (number of risks), so it drives how many
claims happen, not how big each one is. index_losses no longer scales
loss sizes by the exposure ratio; it trends them for inflation only, and
both the severity fit and the frequency count read those inflation-only
losses. The forward book still scales the frequency through
exposure_frequency_factor, and the burning cost on-levels each year's
layer loss to the valuation-year book by the exposure ratio.

This removes a double count: previously exposure scaled both the loss
sizes and the frequency, so doubling the book roughly quadrupled the
expected loss instead of doubling it. The split now matches standard
experience rating, and the Model step explains it.

Co-Authored-By: Claude Opus 4.8 <noreply@anthropic.com>
</commit_message>
<xml_diff>
--- a/Technical documentation.docx
+++ b/Technical documentation.docx
@@ -248,19 +248,25 @@
         <w:t xml:space="preserve"> </w:t>
       </w:r>
       <w:r>
-        <w:t xml:space="preserve">Each historical loss is revalued to the valuation year for</w:t>
-      </w:r>
-      <w:r>
-        <w:t xml:space="preserve"> </w:t>
-      </w:r>
-      <w:r>
-        <w:t xml:space="preserve">inflation and for the change in exposure, so old losses are stated in</w:t>
-      </w:r>
-      <w:r>
-        <w:t xml:space="preserve"> </w:t>
-      </w:r>
-      <w:r>
-        <w:t xml:space="preserve">today’s money and today’s book size.</w:t>
+        <w:t xml:space="preserve">Each historical loss is trended to the valuation year for</w:t>
+      </w:r>
+      <w:r>
+        <w:t xml:space="preserve"> </w:t>
+      </w:r>
+      <w:r>
+        <w:t xml:space="preserve">loss inflation, so old losses are stated in today’s money. The change in book</w:t>
+      </w:r>
+      <w:r>
+        <w:t xml:space="preserve"> </w:t>
+      </w:r>
+      <w:r>
+        <w:t xml:space="preserve">size is handled separately, on the frequency side (exposure is a volume</w:t>
+      </w:r>
+      <w:r>
+        <w:t xml:space="preserve"> </w:t>
+      </w:r>
+      <w:r>
+        <w:t xml:space="preserve">measure).</w:t>
       </w:r>
     </w:p>
     <w:p>
@@ -2730,7 +2736,7 @@
               <w:pStyle w:val="Compact"/>
             </w:pPr>
             <w:r>
-              <w:t xml:space="preserve">indexation, exposure correction, burning cost</w:t>
+              <w:t xml:space="preserve">inflation indexation, exposure scaling, burning cost</w:t>
             </w:r>
           </w:p>
         </w:tc>
@@ -3191,13 +3197,19 @@
         <w:t xml:space="preserve"> </w:t>
       </w:r>
       <w:r>
-        <w:t xml:space="preserve">under different price levels and different book sizes. Two adjustments revalue</w:t>
-      </w:r>
-      <w:r>
-        <w:t xml:space="preserve"> </w:t>
-      </w:r>
-      <w:r>
-        <w:t xml:space="preserve">each loss to the valuation year.</w:t>
+        <w:t xml:space="preserve">under different price levels and in books of different sizes. Loss inflation is</w:t>
+      </w:r>
+      <w:r>
+        <w:t xml:space="preserve"> </w:t>
+      </w:r>
+      <w:r>
+        <w:t xml:space="preserve">handled by revaluing each loss size; exposure is handled separately, on the</w:t>
+      </w:r>
+      <w:r>
+        <w:t xml:space="preserve"> </w:t>
+      </w:r>
+      <w:r>
+        <w:t xml:space="preserve">frequency side, because it is a volume measure.</w:t>
       </w:r>
     </w:p>
     <w:p>
@@ -3459,170 +3471,13 @@
         <w:t xml:space="preserve">preprocess.R</w:t>
       </w:r>
       <w:r>
-        <w:t xml:space="preserve">.</w:t>
-      </w:r>
-    </w:p>
-    <w:p>
-      <w:pPr>
-        <w:pStyle w:val="BodyText"/>
-      </w:pPr>
-      <w:r>
-        <w:rPr>
-          <w:b/>
-          <w:bCs/>
-        </w:rPr>
-        <w:t xml:space="preserve">Exposure correction (on-levelling).</w:t>
-      </w:r>
-      <w:r>
-        <w:t xml:space="preserve"> </w:t>
-      </w:r>
-      <w:r>
-        <w:t xml:space="preserve">The size of a loss is also scaled by how</w:t>
-      </w:r>
-      <w:r>
-        <w:t xml:space="preserve"> </w:t>
-      </w:r>
-      <w:r>
-        <w:t xml:space="preserve">the book grew or shrank between the loss year and the valuation year:</w:t>
-      </w:r>
-    </w:p>
-    <w:p>
-      <w:pPr>
-        <w:pStyle w:val="BodyText"/>
-      </w:pPr>
-      <m:oMathPara>
-        <m:oMathParaPr>
-          <m:jc m:val="center"/>
-        </m:oMathParaPr>
-        <m:oMath>
-          <m:sSubSup>
-            <m:e>
-              <m:r>
-                <m:t>f</m:t>
-              </m:r>
-            </m:e>
-            <m:sub>
-              <m:r>
-                <m:t>y</m:t>
-              </m:r>
-            </m:sub>
-            <m:sup>
-              <m:r>
-                <m:t>e</m:t>
-              </m:r>
-              <m:r>
-                <m:t>x</m:t>
-              </m:r>
-              <m:r>
-                <m:t>p</m:t>
-              </m:r>
-              <m:r>
-                <m:t>o</m:t>
-              </m:r>
-            </m:sup>
-          </m:sSubSup>
-          <m:r>
-            <m:rPr>
-              <m:sty m:val="p"/>
-            </m:rPr>
-            <m:t>=</m:t>
-          </m:r>
-          <m:f>
-            <m:fPr>
-              <m:type m:val="bar"/>
-            </m:fPr>
-            <m:num>
-              <m:sSub>
-                <m:e>
-                  <m:r>
-                    <m:t>E</m:t>
-                  </m:r>
-                </m:e>
-                <m:sub>
-                  <m:r>
-                    <m:t>V</m:t>
-                  </m:r>
-                </m:sub>
-              </m:sSub>
-            </m:num>
-            <m:den>
-              <m:sSub>
-                <m:e>
-                  <m:r>
-                    <m:t>E</m:t>
-                  </m:r>
-                </m:e>
-                <m:sub>
-                  <m:r>
-                    <m:t>y</m:t>
-                  </m:r>
-                </m:sub>
-              </m:sSub>
-            </m:den>
-          </m:f>
-        </m:oMath>
-      </m:oMathPara>
-    </w:p>
-    <w:p>
-      <w:pPr>
-        <w:pStyle w:val="FirstParagraph"/>
-      </w:pPr>
-      <w:r>
-        <w:t xml:space="preserve">where</w:t>
-      </w:r>
-      <w:r>
-        <w:t xml:space="preserve"> </w:t>
-      </w:r>
-      <m:oMath>
-        <m:sSub>
-          <m:e>
-            <m:r>
-              <m:t>E</m:t>
-            </m:r>
-          </m:e>
-          <m:sub>
-            <m:r>
-              <m:t>y</m:t>
-            </m:r>
-          </m:sub>
-        </m:sSub>
-      </m:oMath>
-      <w:r>
-        <w:t xml:space="preserve"> </w:t>
-      </w:r>
-      <w:r>
-        <w:t xml:space="preserve">is the exposure in year</w:t>
-      </w:r>
-      <w:r>
-        <w:t xml:space="preserve"> </w:t>
-      </w:r>
-      <m:oMath>
-        <m:r>
-          <m:t>y</m:t>
-        </m:r>
-      </m:oMath>
-      <w:r>
-        <w:t xml:space="preserve">. This is</w:t>
-      </w:r>
-      <w:r>
-        <w:t xml:space="preserve"> </w:t>
-      </w:r>
-      <w:r>
-        <w:rPr>
-          <w:rStyle w:val="VerbatimChar"/>
-        </w:rPr>
-        <w:t xml:space="preserve">exposure_factor</w:t>
-      </w:r>
-      <w:r>
-        <w:t xml:space="preserve">.</w:t>
-      </w:r>
-    </w:p>
-    <w:p>
-      <w:pPr>
-        <w:pStyle w:val="BodyText"/>
-      </w:pPr>
-      <w:r>
-        <w:t xml:space="preserve">The indexed loss used everywhere downstream is therefore</w:t>
+        <w:t xml:space="preserve">. The inflation-trended loss that both the severity fit and the</w:t>
+      </w:r>
+      <w:r>
+        <w:t xml:space="preserve"> </w:t>
+      </w:r>
+      <w:r>
+        <w:t xml:space="preserve">frequency count read is therefore</w:t>
       </w:r>
     </w:p>
     <w:p>
@@ -3709,38 +3564,6 @@
             <m:rPr>
               <m:sty m:val="p"/>
             </m:rPr>
-            <m:t>⋅</m:t>
-          </m:r>
-          <m:sSubSup>
-            <m:e>
-              <m:r>
-                <m:t>f</m:t>
-              </m:r>
-            </m:e>
-            <m:sub>
-              <m:r>
-                <m:t>y</m:t>
-              </m:r>
-            </m:sub>
-            <m:sup>
-              <m:r>
-                <m:t>e</m:t>
-              </m:r>
-              <m:r>
-                <m:t>x</m:t>
-              </m:r>
-              <m:r>
-                <m:t>p</m:t>
-              </m:r>
-              <m:r>
-                <m:t>o</m:t>
-              </m:r>
-            </m:sup>
-          </m:sSubSup>
-          <m:r>
-            <m:rPr>
-              <m:sty m:val="p"/>
-            </m:rPr>
             <m:t>.</m:t>
           </m:r>
         </m:oMath>
@@ -3755,31 +3578,43 @@
           <w:b/>
           <w:bCs/>
         </w:rPr>
-        <w:t xml:space="preserve">Exposure and frequency.</w:t>
-      </w:r>
-      <w:r>
-        <w:t xml:space="preserve"> </w:t>
-      </w:r>
-      <w:r>
-        <w:t xml:space="preserve">Exposure plays a second, separate role. A larger</w:t>
-      </w:r>
-      <w:r>
-        <w:t xml:space="preserve"> </w:t>
-      </w:r>
-      <w:r>
-        <w:t xml:space="preserve">prospective book is expected to produce proportionally more claims, so the</w:t>
-      </w:r>
-      <w:r>
-        <w:t xml:space="preserve"> </w:t>
-      </w:r>
-      <w:r>
-        <w:t xml:space="preserve">fitted frequency is scaled by the forward book size relative to the average book</w:t>
-      </w:r>
-      <w:r>
-        <w:t xml:space="preserve"> </w:t>
-      </w:r>
-      <w:r>
-        <w:t xml:space="preserve">size over the observed years:</w:t>
+        <w:t xml:space="preserve">Exposure drives frequency, not severity.</w:t>
+      </w:r>
+      <w:r>
+        <w:t xml:space="preserve"> </w:t>
+      </w:r>
+      <w:r>
+        <w:t xml:space="preserve">Exposure is a volume measure (for</w:t>
+      </w:r>
+      <w:r>
+        <w:t xml:space="preserve"> </w:t>
+      </w:r>
+      <w:r>
+        <w:t xml:space="preserve">example the number of risks or buildings insured): it governs how many claims</w:t>
+      </w:r>
+      <w:r>
+        <w:t xml:space="preserve"> </w:t>
+      </w:r>
+      <w:r>
+        <w:t xml:space="preserve">happen, not how big each one is, so it is deliberately not applied to the loss</w:t>
+      </w:r>
+      <w:r>
+        <w:t xml:space="preserve"> </w:t>
+      </w:r>
+      <w:r>
+        <w:t xml:space="preserve">size. A larger prospective book is expected to produce proportionally more</w:t>
+      </w:r>
+      <w:r>
+        <w:t xml:space="preserve"> </w:t>
+      </w:r>
+      <w:r>
+        <w:t xml:space="preserve">claims, so the fitted frequency is scaled by the forward book size relative to</w:t>
+      </w:r>
+      <w:r>
+        <w:t xml:space="preserve"> </w:t>
+      </w:r>
+      <w:r>
+        <w:t xml:space="preserve">the average over the observed years:</w:t>
       </w:r>
     </w:p>
     <w:p>
@@ -3937,13 +3772,117 @@
         <w:t xml:space="preserve"> </w:t>
       </w:r>
       <w:r>
-        <w:t xml:space="preserve">claims. (The dashboard’s information panels now explain both of these exposure</w:t>
-      </w:r>
-      <w:r>
-        <w:t xml:space="preserve"> </w:t>
-      </w:r>
-      <w:r>
-        <w:t xml:space="preserve">roles to the user.)</w:t>
+        <w:t xml:space="preserve">claims. Treating exposure this way matches standard experience rating, where loss</w:t>
+      </w:r>
+      <w:r>
+        <w:t xml:space="preserve"> </w:t>
+      </w:r>
+      <w:r>
+        <w:t xml:space="preserve">amounts are trended for inflation and exposure adjusts the claim count (or, as a</w:t>
+      </w:r>
+      <w:r>
+        <w:t xml:space="preserve"> </w:t>
+      </w:r>
+      <w:r>
+        <w:t xml:space="preserve">rate, the denominator), not the size of each loss.</w:t>
+      </w:r>
+    </w:p>
+    <w:p>
+      <w:pPr>
+        <w:pStyle w:val="BodyText"/>
+      </w:pPr>
+      <w:r>
+        <w:rPr>
+          <w:b/>
+          <w:bCs/>
+        </w:rPr>
+        <w:t xml:space="preserve">Burning cost on-levelling.</w:t>
+      </w:r>
+      <w:r>
+        <w:t xml:space="preserve"> </w:t>
+      </w:r>
+      <w:r>
+        <w:t xml:space="preserve">The empirical burning cost benchmark (below) is</w:t>
+      </w:r>
+      <w:r>
+        <w:t xml:space="preserve"> </w:t>
+      </w:r>
+      <w:r>
+        <w:t xml:space="preserve">put on the same forward book by scaling each observed year’s layer loss by the</w:t>
+      </w:r>
+      <w:r>
+        <w:t xml:space="preserve"> </w:t>
+      </w:r>
+      <w:r>
+        <w:t xml:space="preserve">exposure ratio</w:t>
+      </w:r>
+      <w:r>
+        <w:t xml:space="preserve"> </w:t>
+      </w:r>
+      <m:oMath>
+        <m:sSub>
+          <m:e>
+            <m:r>
+              <m:t>E</m:t>
+            </m:r>
+          </m:e>
+          <m:sub>
+            <m:r>
+              <m:t>V</m:t>
+            </m:r>
+          </m:sub>
+        </m:sSub>
+        <m:r>
+          <m:rPr>
+            <m:sty m:val="p"/>
+          </m:rPr>
+          <m:t>/</m:t>
+        </m:r>
+        <m:sSub>
+          <m:e>
+            <m:r>
+              <m:t>E</m:t>
+            </m:r>
+          </m:e>
+          <m:sub>
+            <m:r>
+              <m:t>y</m:t>
+            </m:r>
+          </m:sub>
+        </m:sSub>
+      </m:oMath>
+      <w:r>
+        <w:t xml:space="preserve"> </w:t>
+      </w:r>
+      <w:r>
+        <w:t xml:space="preserve">(</w:t>
+      </w:r>
+      <w:r>
+        <w:rPr>
+          <w:rStyle w:val="VerbatimChar"/>
+        </w:rPr>
+        <w:t xml:space="preserve">exposure_factor</w:t>
+      </w:r>
+      <w:r>
+        <w:t xml:space="preserve">). This is again a volume</w:t>
+      </w:r>
+      <w:r>
+        <w:t xml:space="preserve"> </w:t>
+      </w:r>
+      <w:r>
+        <w:t xml:space="preserve">adjustment to the year’s total layer loss, not a change to individual loss</w:t>
+      </w:r>
+      <w:r>
+        <w:t xml:space="preserve"> </w:t>
+      </w:r>
+      <w:r>
+        <w:t xml:space="preserve">sizes. (The dashboard’s information panels explain these exposure roles to the</w:t>
+      </w:r>
+      <w:r>
+        <w:t xml:space="preserve"> </w:t>
+      </w:r>
+      <w:r>
+        <w:t xml:space="preserve">user.)</w:t>
       </w:r>
     </w:p>
     <w:bookmarkEnd w:id="31"/>
@@ -7415,31 +7354,31 @@
         <w:t xml:space="preserve"> </w:t>
       </w:r>
       <w:r>
-        <w:t xml:space="preserve">basis (every past loss indexed for inflation and corrected for exposure, as if it</w:t>
-      </w:r>
-      <w:r>
-        <w:t xml:space="preserve"> </w:t>
-      </w:r>
-      <w:r>
-        <w:t xml:space="preserve">had happened in the valuation year). Each historical year is layered per loss and</w:t>
-      </w:r>
-      <w:r>
-        <w:t xml:space="preserve"> </w:t>
-      </w:r>
-      <w:r>
-        <w:t xml:space="preserve">then run through the layer’s annual aggregate deductible and limit, so the</w:t>
-      </w:r>
-      <w:r>
-        <w:t xml:space="preserve"> </w:t>
-      </w:r>
-      <w:r>
-        <w:t xml:space="preserve">benchmark reflects the full layer terms (AAD and AAL included), the same way the</w:t>
-      </w:r>
-      <w:r>
-        <w:t xml:space="preserve"> </w:t>
-      </w:r>
-      <w:r>
-        <w:t xml:space="preserve">pricer does. Unlike the oracle, this carries no model, so it is the external</w:t>
+        <w:t xml:space="preserve">basis (every past loss trended for inflation, and each year’s layer loss then</w:t>
+      </w:r>
+      <w:r>
+        <w:t xml:space="preserve"> </w:t>
+      </w:r>
+      <w:r>
+        <w:t xml:space="preserve">on-levelled to the valuation-year book by exposure, as if it had happened now).</w:t>
+      </w:r>
+      <w:r>
+        <w:t xml:space="preserve"> </w:t>
+      </w:r>
+      <w:r>
+        <w:t xml:space="preserve">Each historical year is layered per loss and then run through the layer’s annual</w:t>
+      </w:r>
+      <w:r>
+        <w:t xml:space="preserve"> </w:t>
+      </w:r>
+      <w:r>
+        <w:t xml:space="preserve">aggregate deductible and limit, so the benchmark reflects the full layer terms</w:t>
+      </w:r>
+      <w:r>
+        <w:t xml:space="preserve"> </w:t>
+      </w:r>
+      <w:r>
+        <w:t xml:space="preserve">(AAD and AAL included), the same way the pricer does. Unlike the oracle, this carries no model, so it is the external</w:t>
       </w:r>
       <w:r>
         <w:t xml:space="preserve"> </w:t>

</xml_diff>

<commit_message>
Plot the simulated loss distribution per layer on the Price step
Surface the per-layer annual loss vector the pricer already computes:
extract layer_annual_losses in price.R (price_layer now calls it), and
return annual_by_layer from price_models. The Price step gains a layer
selector and a histogram of the chosen layer's simulated annual losses,
with the mean, VaR and TVaR from the Results table marked on it and the
share of simulated years with no loss to the layer annotated. The long
tail is capped at the TVaR or the 99.5th percentile so the bulk stays
readable, with a note on the hidden share.

Co-Authored-By: Claude Opus 4.8 <noreply@anthropic.com>
</commit_message>
<xml_diff>
--- a/Technical documentation.docx
+++ b/Technical documentation.docx
@@ -6578,6 +6578,86 @@
     <w:p>
       <w:pPr>
         <w:pStyle w:val="FirstParagraph"/>
+      </w:pPr>
+      <w:r>
+        <w:t xml:space="preserve">The Price step also plots this empirical distribution per layer: a histogram of</w:t>
+      </w:r>
+      <w:r>
+        <w:t xml:space="preserve"> </w:t>
+      </w:r>
+      <w:r>
+        <w:t xml:space="preserve">the simulated annual losses to the selected layer, with the mean, VaR and TVaR</w:t>
+      </w:r>
+      <w:r>
+        <w:t xml:space="preserve"> </w:t>
+      </w:r>
+      <w:r>
+        <w:t xml:space="preserve">marked on it (the same values shown in the Results table), and the share of</w:t>
+      </w:r>
+      <w:r>
+        <w:t xml:space="preserve"> </w:t>
+      </w:r>
+      <w:r>
+        <w:t xml:space="preserve">simulated years with no loss to the layer annotated. High layers are pierced</w:t>
+      </w:r>
+      <w:r>
+        <w:t xml:space="preserve"> </w:t>
+      </w:r>
+      <w:r>
+        <w:t xml:space="preserve">only rarely, so most of their simulated years sit at zero. The per-layer loss</w:t>
+      </w:r>
+      <w:r>
+        <w:t xml:space="preserve"> </w:t>
+      </w:r>
+      <w:r>
+        <w:t xml:space="preserve">vectors come from</w:t>
+      </w:r>
+      <w:r>
+        <w:t xml:space="preserve"> </w:t>
+      </w:r>
+      <w:r>
+        <w:rPr>
+          <w:rStyle w:val="VerbatimChar"/>
+        </w:rPr>
+        <w:t xml:space="preserve">layer_annual_losses</w:t>
+      </w:r>
+      <w:r>
+        <w:t xml:space="preserve"> </w:t>
+      </w:r>
+      <w:r>
+        <w:t xml:space="preserve">in</w:t>
+      </w:r>
+      <w:r>
+        <w:t xml:space="preserve"> </w:t>
+      </w:r>
+      <w:r>
+        <w:rPr>
+          <w:rStyle w:val="VerbatimChar"/>
+        </w:rPr>
+        <w:t xml:space="preserve">price.R</w:t>
+      </w:r>
+      <w:r>
+        <w:t xml:space="preserve">, the same function</w:t>
+      </w:r>
+      <w:r>
+        <w:t xml:space="preserve"> </w:t>
+      </w:r>
+      <w:r>
+        <w:rPr>
+          <w:rStyle w:val="VerbatimChar"/>
+        </w:rPr>
+        <w:t xml:space="preserve">price_layer</w:t>
+      </w:r>
+      <w:r>
+        <w:t xml:space="preserve"> </w:t>
+      </w:r>
+      <w:r>
+        <w:t xml:space="preserve">summarises, so the plot and the headline numbers always agree.</w:t>
+      </w:r>
+    </w:p>
+    <w:p>
+      <w:pPr>
+        <w:pStyle w:val="BodyText"/>
       </w:pPr>
       <w:r>
         <w:t xml:space="preserve">Two premium principles are reported, both driven by user-set loadings:</w:t>

</xml_diff>

<commit_message>
Fix the burning cost so the AAL binds and zero-loss years count
Two bugs in the burning cost benchmark:

- Exposure on-levelling multiplied the annual layer loss after the AAD
  and AAL were applied, so the exposure factor could push a capped value
  above the AAL (e.g. an AAL of 5 reading 6.25). annual_layer_loss gains
  a scale argument (default 1) that scales the aggregate before the caps,
  so the limit still binds.

- The average was taken only over years that had losses, dropping
  zero-loss years from the denominator and overstating the result. It now
  averages over the observed years (exposure years up to the latest loss
  year), the same window the frequency uses, so an empty year counts as a
  zero.

Co-Authored-By: Claude Opus 4.8 <noreply@anthropic.com>
</commit_message>
<xml_diff>
--- a/Technical documentation.docx
+++ b/Technical documentation.docx
@@ -3808,13 +3808,13 @@
         <w:t xml:space="preserve"> </w:t>
       </w:r>
       <w:r>
-        <w:t xml:space="preserve">put on the same forward book by scaling each observed year’s layer loss by the</w:t>
-      </w:r>
-      <w:r>
-        <w:t xml:space="preserve"> </w:t>
-      </w:r>
-      <w:r>
-        <w:t xml:space="preserve">exposure ratio</w:t>
+        <w:t xml:space="preserve">put on the same forward book by scaling each observed year’s aggregate of layer</w:t>
+      </w:r>
+      <w:r>
+        <w:t xml:space="preserve"> </w:t>
+      </w:r>
+      <w:r>
+        <w:t xml:space="preserve">recoveries by the exposure ratio</w:t>
       </w:r>
       <w:r>
         <w:t xml:space="preserve"> </w:t>
@@ -3864,25 +3864,59 @@
         <w:t xml:space="preserve">exposure_factor</w:t>
       </w:r>
       <w:r>
-        <w:t xml:space="preserve">). This is again a volume</w:t>
-      </w:r>
-      <w:r>
-        <w:t xml:space="preserve"> </w:t>
-      </w:r>
-      <w:r>
-        <w:t xml:space="preserve">adjustment to the year’s total layer loss, not a change to individual loss</w:t>
-      </w:r>
-      <w:r>
-        <w:t xml:space="preserve"> </w:t>
-      </w:r>
-      <w:r>
-        <w:t xml:space="preserve">sizes. (The dashboard’s information panels explain these exposure roles to the</w:t>
-      </w:r>
-      <w:r>
-        <w:t xml:space="preserve"> </w:t>
-      </w:r>
-      <w:r>
-        <w:t xml:space="preserve">user.)</w:t>
+        <w:t xml:space="preserve">). This is again a</w:t>
+      </w:r>
+      <w:r>
+        <w:t xml:space="preserve"> </w:t>
+      </w:r>
+      <w:r>
+        <w:t xml:space="preserve">volume adjustment, not a change to individual loss sizes. The scaling is applied</w:t>
+      </w:r>
+      <w:r>
+        <w:t xml:space="preserve"> </w:t>
+      </w:r>
+      <w:r>
+        <w:rPr>
+          <w:i/>
+          <w:iCs/>
+        </w:rPr>
+        <w:t xml:space="preserve">before</w:t>
+      </w:r>
+      <w:r>
+        <w:t xml:space="preserve"> </w:t>
+      </w:r>
+      <w:r>
+        <w:t xml:space="preserve">the annual aggregate deductible and limit, so those caps still bind on</w:t>
+      </w:r>
+      <w:r>
+        <w:t xml:space="preserve"> </w:t>
+      </w:r>
+      <w:r>
+        <w:t xml:space="preserve">the on-levelled figure (scaling after the cap could push the result above an</w:t>
+      </w:r>
+      <w:r>
+        <w:t xml:space="preserve"> </w:t>
+      </w:r>
+      <w:r>
+        <w:t xml:space="preserve">AAL). The average is taken over the observed years, the same window the frequency</w:t>
+      </w:r>
+      <w:r>
+        <w:t xml:space="preserve"> </w:t>
+      </w:r>
+      <w:r>
+        <w:t xml:space="preserve">uses, so a year with no losses counts as a zero rather than being dropped from</w:t>
+      </w:r>
+      <w:r>
+        <w:t xml:space="preserve"> </w:t>
+      </w:r>
+      <w:r>
+        <w:t xml:space="preserve">the denominator. (The dashboard’s information panels explain these exposure roles</w:t>
+      </w:r>
+      <w:r>
+        <w:t xml:space="preserve"> </w:t>
+      </w:r>
+      <w:r>
+        <w:t xml:space="preserve">to the user.)</w:t>
       </w:r>
     </w:p>
     <w:bookmarkEnd w:id="31"/>

</xml_diff>

<commit_message>
Update docs to match the current step order and module map
Correct the README step order and the app.R header comment to
Data, Structure, Model, Price, add report.R and template.R to the
module map, and regenerate the Word documentation.
</commit_message>
<xml_diff>
--- a/Technical documentation.docx
+++ b/Technical documentation.docx
@@ -2932,6 +2932,75 @@
             </w:r>
             <w:r>
               <w:t xml:space="preserve">)</w:t>
+            </w:r>
+          </w:p>
+        </w:tc>
+      </w:tr>
+      <w:tr>
+        <w:tc>
+          <w:tcPr/>
+          <w:p>
+            <w:pPr>
+              <w:pStyle w:val="Compact"/>
+            </w:pPr>
+            <w:r>
+              <w:rPr>
+                <w:rStyle w:val="VerbatimChar"/>
+              </w:rPr>
+              <w:t xml:space="preserve">report.R</w:t>
+            </w:r>
+          </w:p>
+        </w:tc>
+        <w:tc>
+          <w:tcPr/>
+          <w:p>
+            <w:pPr>
+              <w:pStyle w:val="Compact"/>
+            </w:pPr>
+            <w:r>
+              <w:t xml:space="preserve">shared display formatters, so the dashboard tables and the Excel report match</w:t>
+            </w:r>
+          </w:p>
+        </w:tc>
+      </w:tr>
+      <w:tr>
+        <w:tc>
+          <w:tcPr/>
+          <w:p>
+            <w:pPr>
+              <w:pStyle w:val="Compact"/>
+            </w:pPr>
+            <w:r>
+              <w:rPr>
+                <w:rStyle w:val="VerbatimChar"/>
+              </w:rPr>
+              <w:t xml:space="preserve">template.R</w:t>
+            </w:r>
+          </w:p>
+        </w:tc>
+        <w:tc>
+          <w:tcPr/>
+          <w:p>
+            <w:pPr>
+              <w:pStyle w:val="Compact"/>
+            </w:pPr>
+            <w:r>
+              <w:t xml:space="preserve">build the styled</w:t>
+            </w:r>
+            <w:r>
+              <w:t xml:space="preserve"> </w:t>
+            </w:r>
+            <w:r>
+              <w:rPr>
+                <w:rStyle w:val="VerbatimChar"/>
+              </w:rPr>
+              <w:t xml:space="preserve">input.xlsx</w:t>
+            </w:r>
+            <w:r>
+              <w:t xml:space="preserve"> </w:t>
+            </w:r>
+            <w:r>
+              <w:t xml:space="preserve">template (used by the launcher and the Generate template button)</w:t>
             </w:r>
           </w:p>
         </w:tc>

</xml_diff>

<commit_message>
Lead the run section with the double-click path
Make clear the everyday user just double-clicks start.vbs and needs no
commands or R knowledge, and mark the Rscript commands as developer use.
</commit_message>
<xml_diff>
--- a/Technical documentation.docx
+++ b/Technical documentation.docx
@@ -1352,14 +1352,93 @@
         <w:pStyle w:val="FirstParagraph"/>
       </w:pPr>
       <w:r>
-        <w:t xml:space="preserve">All commands below run from inside the</w:t>
-      </w:r>
-      <w:r>
+        <w:rPr>
+          <w:b/>
+          <w:bCs/>
+        </w:rPr>
+        <w:t xml:space="preserve">The everyday way is to just double-click</w:t>
+      </w:r>
+      <w:r>
+        <w:rPr>
+          <w:b/>
+          <w:bCs/>
+        </w:rPr>
         <w:t xml:space="preserve"> </w:t>
       </w:r>
       <w:r>
         <w:rPr>
           <w:rStyle w:val="VerbatimChar"/>
+          <w:b/>
+          <w:bCs/>
+        </w:rPr>
+        <w:t xml:space="preserve">start.vbs</w:t>
+      </w:r>
+      <w:r>
+        <w:rPr>
+          <w:b/>
+          <w:bCs/>
+        </w:rPr>
+        <w:t xml:space="preserve">.</w:t>
+      </w:r>
+      <w:r>
+        <w:t xml:space="preserve"> </w:t>
+      </w:r>
+      <w:r>
+        <w:t xml:space="preserve">That is all an end</w:t>
+      </w:r>
+      <w:r>
+        <w:t xml:space="preserve"> </w:t>
+      </w:r>
+      <w:r>
+        <w:t xml:space="preserve">user needs to do: it installs anything missing on the first run and opens the</w:t>
+      </w:r>
+      <w:r>
+        <w:t xml:space="preserve"> </w:t>
+      </w:r>
+      <w:r>
+        <w:t xml:space="preserve">dashboard in the browser (see Installation and first run above).</w:t>
+      </w:r>
+      <w:r>
+        <w:t xml:space="preserve"> </w:t>
+      </w:r>
+      <w:r>
+        <w:rPr>
+          <w:rStyle w:val="VerbatimChar"/>
+        </w:rPr>
+        <w:t xml:space="preserve">engine\start.bat</w:t>
+      </w:r>
+      <w:r>
+        <w:t xml:space="preserve"> </w:t>
+      </w:r>
+      <w:r>
+        <w:t xml:space="preserve">does the same with a visible console, for troubleshooting.</w:t>
+      </w:r>
+      <w:r>
+        <w:t xml:space="preserve"> </w:t>
+      </w:r>
+      <w:r>
+        <w:t xml:space="preserve">No commands and no R knowledge are required.</w:t>
+      </w:r>
+    </w:p>
+    <w:p>
+      <w:pPr>
+        <w:pStyle w:val="BodyText"/>
+      </w:pPr>
+      <w:r>
+        <w:t xml:space="preserve">The rest of this section is for developers and advanced use only. These commands</w:t>
+      </w:r>
+      <w:r>
+        <w:t xml:space="preserve"> </w:t>
+      </w:r>
+      <w:r>
+        <w:t xml:space="preserve">all run from inside the</w:t>
+      </w:r>
+      <w:r>
+        <w:t xml:space="preserve"> </w:t>
+      </w:r>
+      <w:r>
+        <w:rPr>
+          <w:rStyle w:val="VerbatimChar"/>
         </w:rPr>
         <w:t xml:space="preserve">engine/</w:t>
       </w:r>
@@ -1367,7 +1446,7 @@
         <w:t xml:space="preserve"> </w:t>
       </w:r>
       <w:r>
-        <w:t xml:space="preserve">folder.</w:t>
+        <w:t xml:space="preserve">folder:</w:t>
       </w:r>
     </w:p>
     <w:p>

</xml_diff>

<commit_message>
Clarify launcher wording and add the Parodi reference
Replace "hidden launcher" with "no console window" so it no longer reads
as if the launcher itself is hidden, and add Parodi, Pricing in General
Insurance, to the references.
</commit_message>
<xml_diff>
--- a/Technical documentation.docx
+++ b/Technical documentation.docx
@@ -909,13 +909,13 @@
         <w:t xml:space="preserve"> </w:t>
       </w:r>
       <w:r>
-        <w:t xml:space="preserve">folder. It launches the tool hidden (no console window) and opens the dashboard</w:t>
-      </w:r>
-      <w:r>
-        <w:t xml:space="preserve"> </w:t>
-      </w:r>
-      <w:r>
-        <w:t xml:space="preserve">in the default browser.</w:t>
+        <w:t xml:space="preserve">folder. It runs with no console window and opens the dashboard in the default</w:t>
+      </w:r>
+      <w:r>
+        <w:t xml:space="preserve"> </w:t>
+      </w:r>
+      <w:r>
+        <w:t xml:space="preserve">browser.</w:t>
       </w:r>
       <w:r>
         <w:t xml:space="preserve"> </w:t>
@@ -930,13 +930,13 @@
         <w:t xml:space="preserve"> </w:t>
       </w:r>
       <w:r>
-        <w:t xml:space="preserve">does the same with a visible console,</w:t>
-      </w:r>
-      <w:r>
-        <w:t xml:space="preserve"> </w:t>
-      </w:r>
-      <w:r>
-        <w:t xml:space="preserve">which is useful for troubleshooting.</w:t>
+        <w:t xml:space="preserve">does the same with a visible console, which is</w:t>
+      </w:r>
+      <w:r>
+        <w:t xml:space="preserve"> </w:t>
+      </w:r>
+      <w:r>
+        <w:t xml:space="preserve">useful for troubleshooting.</w:t>
       </w:r>
     </w:p>
     <w:p>
@@ -1073,7 +1073,7 @@
               <w:pStyle w:val="Compact"/>
             </w:pPr>
             <w:r>
-              <w:t xml:space="preserve">Hidden launcher (double-click to run).</w:t>
+              <w:t xml:space="preserve">Double-click launcher; runs with no console window.</w:t>
             </w:r>
           </w:p>
         </w:tc>
@@ -7918,6 +7918,43 @@
       </w:r>
       <w:r>
         <w:t xml:space="preserve">tool.</w:t>
+      </w:r>
+    </w:p>
+    <w:p>
+      <w:pPr>
+        <w:pStyle w:val="Compact"/>
+        <w:numPr>
+          <w:ilvl w:val="0"/>
+          <w:numId w:val="1014"/>
+        </w:numPr>
+      </w:pPr>
+      <w:r>
+        <w:t xml:space="preserve">P. Parodi,</w:t>
+      </w:r>
+      <w:r>
+        <w:t xml:space="preserve"> </w:t>
+      </w:r>
+      <w:r>
+        <w:rPr>
+          <w:i/>
+          <w:iCs/>
+        </w:rPr>
+        <w:t xml:space="preserve">Pricing in General Insurance</w:t>
+      </w:r>
+      <w:r>
+        <w:t xml:space="preserve">, CRC Press, 2014. General background</w:t>
+      </w:r>
+      <w:r>
+        <w:t xml:space="preserve"> </w:t>
+      </w:r>
+      <w:r>
+        <w:t xml:space="preserve">on experience and exposure rating. This third-party material is kept locally</w:t>
+      </w:r>
+      <w:r>
+        <w:t xml:space="preserve"> </w:t>
+      </w:r>
+      <w:r>
+        <w:t xml:space="preserve">and is not distributed with the tool.</w:t>
       </w:r>
     </w:p>
     <w:p>

</xml_diff>

<commit_message>
Drop exposure rating from the Parodi reference
The tool is purely experience based, so the reference no longer implies
exposure rating (which is listed under future work).
</commit_message>
<xml_diff>
--- a/Technical documentation.docx
+++ b/Technical documentation.docx
@@ -7948,13 +7948,13 @@
         <w:t xml:space="preserve"> </w:t>
       </w:r>
       <w:r>
-        <w:t xml:space="preserve">on experience and exposure rating. This third-party material is kept locally</w:t>
-      </w:r>
-      <w:r>
-        <w:t xml:space="preserve"> </w:t>
-      </w:r>
-      <w:r>
-        <w:t xml:space="preserve">and is not distributed with the tool.</w:t>
+        <w:t xml:space="preserve">on experience rating. This third-party material is kept locally and is not</w:t>
+      </w:r>
+      <w:r>
+        <w:t xml:space="preserve"> </w:t>
+      </w:r>
+      <w:r>
+        <w:t xml:space="preserve">distributed with the tool.</w:t>
       </w:r>
     </w:p>
     <w:p>

</xml_diff>

<commit_message>
Update documentation for the review fixes and add the Fable review
Co-Authored-By: Claude Fable 5 <noreply@anthropic.com>
</commit_message>
<xml_diff>
--- a/Technical documentation.docx
+++ b/Technical documentation.docx
@@ -730,13 +730,13 @@
         <w:rPr>
           <w:rStyle w:val="VerbatimChar"/>
         </w:rPr>
-        <w:t xml:space="preserve">fitdistrplus</w:t>
-      </w:r>
-      <w:r>
-        <w:t xml:space="preserve"> </w:t>
-      </w:r>
-      <w:r>
-        <w:t xml:space="preserve">(lognormal maximum likelihood),</w:t>
+        <w:t xml:space="preserve">readxl</w:t>
+      </w:r>
+      <w:r>
+        <w:t xml:space="preserve"> </w:t>
+      </w:r>
+      <w:r>
+        <w:t xml:space="preserve">(reading Excel), and</w:t>
       </w:r>
       <w:r>
         <w:t xml:space="preserve"> </w:t>
@@ -745,28 +745,28 @@
         <w:rPr>
           <w:rStyle w:val="VerbatimChar"/>
         </w:rPr>
-        <w:t xml:space="preserve">readxl</w:t>
-      </w:r>
-      <w:r>
-        <w:t xml:space="preserve"> </w:t>
-      </w:r>
-      <w:r>
-        <w:t xml:space="preserve">(reading Excel), and</w:t>
-      </w:r>
-      <w:r>
-        <w:t xml:space="preserve"> </w:t>
+        <w:t xml:space="preserve">openxlsx</w:t>
+      </w:r>
+      <w:r>
+        <w:t xml:space="preserve"> </w:t>
+      </w:r>
+      <w:r>
+        <w:t xml:space="preserve">(writing</w:t>
+      </w:r>
+      <w:r>
+        <w:t xml:space="preserve"> </w:t>
+      </w:r>
+      <w:r>
+        <w:t xml:space="preserve">Excel). All fitting uses base R (</w:t>
       </w:r>
       <w:r>
         <w:rPr>
           <w:rStyle w:val="VerbatimChar"/>
         </w:rPr>
-        <w:t xml:space="preserve">openxlsx</w:t>
-      </w:r>
-      <w:r>
-        <w:t xml:space="preserve"> </w:t>
-      </w:r>
-      <w:r>
-        <w:t xml:space="preserve">(writing Excel).</w:t>
+        <w:t xml:space="preserve">stats</w:t>
+      </w:r>
+      <w:r>
+        <w:t xml:space="preserve">).</w:t>
       </w:r>
       <w:r>
         <w:t xml:space="preserve"> </w:t>
@@ -781,19 +781,13 @@
         <w:t xml:space="preserve"> </w:t>
       </w:r>
       <w:r>
-        <w:t xml:space="preserve">is needed only to</w:t>
-      </w:r>
-      <w:r>
-        <w:t xml:space="preserve"> </w:t>
-      </w:r>
-      <w:r>
-        <w:t xml:space="preserve">run the test suite. These are installed automatically on first run (see</w:t>
-      </w:r>
-      <w:r>
-        <w:t xml:space="preserve"> </w:t>
-      </w:r>
-      <w:r>
-        <w:t xml:space="preserve">below).</w:t>
+        <w:t xml:space="preserve">is needed only to run</w:t>
+      </w:r>
+      <w:r>
+        <w:t xml:space="preserve"> </w:t>
+      </w:r>
+      <w:r>
+        <w:t xml:space="preserve">the test suite. These are installed automatically on first run (see below).</w:t>
       </w:r>
     </w:p>
     <w:p>
@@ -1849,7 +1843,56 @@
               <w:pStyle w:val="Compact"/>
             </w:pPr>
             <w:r>
-              <w:t xml:space="preserve">the loss size above which the data is complete; it bounds the modelling threshold from below</w:t>
+              <w:t xml:space="preserve">the loss size above which the data is complete; indexed to the valuation year it bounds the modelling threshold from below</w:t>
+            </w:r>
+          </w:p>
+        </w:tc>
+      </w:tr>
+      <w:tr>
+        <w:tc>
+          <w:tcPr/>
+          <w:p>
+            <w:pPr>
+              <w:pStyle w:val="Compact"/>
+            </w:pPr>
+            <w:r>
+              <w:rPr>
+                <w:rStyle w:val="VerbatimChar"/>
+              </w:rPr>
+              <w:t xml:space="preserve">last_complete_year</w:t>
+            </w:r>
+          </w:p>
+        </w:tc>
+        <w:tc>
+          <w:tcPr/>
+          <w:p>
+            <w:pPr>
+              <w:pStyle w:val="Compact"/>
+            </w:pPr>
+            <w:r>
+              <w:t xml:space="preserve">2025</w:t>
+            </w:r>
+          </w:p>
+        </w:tc>
+        <w:tc>
+          <w:tcPr/>
+          <w:p>
+            <w:pPr>
+              <w:pStyle w:val="Compact"/>
+            </w:pPr>
+            <w:r>
+              <w:t xml:space="preserve">no</w:t>
+            </w:r>
+          </w:p>
+        </w:tc>
+        <w:tc>
+          <w:tcPr/>
+          <w:p>
+            <w:pPr>
+              <w:pStyle w:val="Compact"/>
+            </w:pPr>
+            <w:r>
+              <w:t xml:space="preserve">the last year with complete loss data; it ends the frequency and burning cost window (defaults to the latest loss year)</w:t>
             </w:r>
           </w:p>
         </w:tc>
@@ -1964,7 +2007,13 @@
         <w:t xml:space="preserve"> </w:t>
       </w:r>
       <w:r>
-        <w:t xml:space="preserve">splice threshold, frequency model, simulations, loadings, VaR level). When</w:t>
+        <w:t xml:space="preserve">splice threshold, frequency model, Pareto bias correction, simulations,</w:t>
+      </w:r>
+      <w:r>
+        <w:t xml:space="preserve"> </w:t>
+      </w:r>
+      <w:r>
+        <w:t xml:space="preserve">loadings, VaR level). When</w:t>
       </w:r>
       <w:r>
         <w:t xml:space="preserve"> </w:t>
@@ -2028,6 +2077,65 @@
       </w:r>
       <w:r>
         <w:t xml:space="preserve">modelled.</w:t>
+      </w:r>
+    </w:p>
+    <w:p>
+      <w:pPr>
+        <w:pStyle w:val="BodyText"/>
+      </w:pPr>
+      <w:r>
+        <w:t xml:space="preserve">On load,</w:t>
+      </w:r>
+      <w:r>
+        <w:t xml:space="preserve"> </w:t>
+      </w:r>
+      <w:r>
+        <w:rPr>
+          <w:rStyle w:val="VerbatimChar"/>
+        </w:rPr>
+        <w:t xml:space="preserve">read_input</w:t>
+      </w:r>
+      <w:r>
+        <w:t xml:space="preserve"> </w:t>
+      </w:r>
+      <w:r>
+        <w:t xml:space="preserve">checks the workbook and refuses data the pipeline cannot</w:t>
+      </w:r>
+      <w:r>
+        <w:t xml:space="preserve"> </w:t>
+      </w:r>
+      <w:r>
+        <w:t xml:space="preserve">price safely, with a plain message naming the sheet to fix: missing or</w:t>
+      </w:r>
+      <w:r>
+        <w:t xml:space="preserve"> </w:t>
+      </w:r>
+      <w:r>
+        <w:t xml:space="preserve">non-positive losses, missing years, duplicate exposure or inflation years,</w:t>
+      </w:r>
+      <w:r>
+        <w:t xml:space="preserve"> </w:t>
+      </w:r>
+      <w:r>
+        <w:t xml:space="preserve">non-positive exposures, loss years with no exposure row, and inflation that</w:t>
+      </w:r>
+      <w:r>
+        <w:t xml:space="preserve"> </w:t>
+      </w:r>
+      <w:r>
+        <w:t xml:space="preserve">does not cover the span from the oldest loss to the valuation year. Losses at</w:t>
+      </w:r>
+      <w:r>
+        <w:t xml:space="preserve"> </w:t>
+      </w:r>
+      <w:r>
+        <w:t xml:space="preserve">or below the reporting threshold are accepted but flagged with a warning on</w:t>
+      </w:r>
+      <w:r>
+        <w:t xml:space="preserve"> </w:t>
+      </w:r>
+      <w:r>
+        <w:t xml:space="preserve">the Data step, since they contradict the declared completeness threshold.</w:t>
       </w:r>
     </w:p>
     <w:p>
@@ -2595,7 +2703,13 @@
         <w:t xml:space="preserve">run_pricing</w:t>
       </w:r>
       <w:r>
-        <w:t xml:space="preserve">, the tool writes a two-sheet workbook:</w:t>
+        <w:t xml:space="preserve">, the tool writes a four-sheet workbook (the same builder serves</w:t>
+      </w:r>
+      <w:r>
+        <w:t xml:space="preserve"> </w:t>
+      </w:r>
+      <w:r>
+        <w:t xml:space="preserve">both paths, so the two exports never drift apart):</w:t>
       </w:r>
     </w:p>
     <w:p>
@@ -2621,13 +2735,7 @@
         <w:t xml:space="preserve"> </w:t>
       </w:r>
       <w:r>
-        <w:t xml:space="preserve">VaR, TVaR, both premiums, the closed-form expected loss, and the</w:t>
-      </w:r>
-      <w:r>
-        <w:t xml:space="preserve"> </w:t>
-      </w:r>
-      <w:r>
-        <w:t xml:space="preserve">validation delta.</w:t>
+        <w:t xml:space="preserve">VaR, TVaR, and both premiums.</w:t>
       </w:r>
     </w:p>
     <w:p>
@@ -2644,16 +2752,74 @@
           <w:b/>
           <w:bCs/>
         </w:rPr>
+        <w:t xml:space="preserve">validation</w:t>
+      </w:r>
+      <w:r>
+        <w:t xml:space="preserve">: the simulated against closed-form expected loss, their</w:t>
+      </w:r>
+      <w:r>
+        <w:t xml:space="preserve"> </w:t>
+      </w:r>
+      <w:r>
+        <w:t xml:space="preserve">delta, the Monte Carlo standard error, and the burning cost benchmark.</w:t>
+      </w:r>
+    </w:p>
+    <w:p>
+      <w:pPr>
+        <w:pStyle w:val="Compact"/>
+        <w:numPr>
+          <w:ilvl w:val="0"/>
+          <w:numId w:val="1005"/>
+        </w:numPr>
+      </w:pPr>
+      <w:r>
+        <w:rPr>
+          <w:rStyle w:val="VerbatimChar"/>
+          <w:b/>
+          <w:bCs/>
+        </w:rPr>
+        <w:t xml:space="preserve">contract</w:t>
+      </w:r>
+      <w:r>
+        <w:t xml:space="preserve">: an echo of the priced layer structure with its full terms</w:t>
+      </w:r>
+      <w:r>
+        <w:t xml:space="preserve"> </w:t>
+      </w:r>
+      <w:r>
+        <w:t xml:space="preserve">(deductible, cover, AAD, AAL).</w:t>
+      </w:r>
+    </w:p>
+    <w:p>
+      <w:pPr>
+        <w:pStyle w:val="Compact"/>
+        <w:numPr>
+          <w:ilvl w:val="0"/>
+          <w:numId w:val="1005"/>
+        </w:numPr>
+      </w:pPr>
+      <w:r>
+        <w:rPr>
+          <w:rStyle w:val="VerbatimChar"/>
+          <w:b/>
+          <w:bCs/>
+        </w:rPr>
         <w:t xml:space="preserve">assumptions</w:t>
       </w:r>
       <w:r>
-        <w:t xml:space="preserve">: an echo of the fitted parameters and the settings used, so</w:t>
-      </w:r>
-      <w:r>
-        <w:t xml:space="preserve"> </w:t>
-      </w:r>
-      <w:r>
-        <w:t xml:space="preserve">a result is self-documenting.</w:t>
+        <w:t xml:space="preserve">: an echo of the settings and the fitted parameters</w:t>
+      </w:r>
+      <w:r>
+        <w:t xml:space="preserve"> </w:t>
+      </w:r>
+      <w:r>
+        <w:t xml:space="preserve">(expected claims, Pareto alpha, lognormal body, tail weight, seed), so a</w:t>
+      </w:r>
+      <w:r>
+        <w:t xml:space="preserve"> </w:t>
+      </w:r>
+      <w:r>
+        <w:t xml:space="preserve">result can be reconstructed from the file alone.</w:t>
       </w:r>
     </w:p>
     <w:bookmarkEnd w:id="28"/>
@@ -3720,6 +3886,176 @@
     <w:p>
       <w:pPr>
         <w:pStyle w:val="FirstParagraph"/>
+      </w:pPr>
+      <w:r>
+        <w:rPr>
+          <w:b/>
+          <w:bCs/>
+        </w:rPr>
+        <w:t xml:space="preserve">The reporting threshold must be indexed too.</w:t>
+      </w:r>
+      <w:r>
+        <w:t xml:space="preserve"> </w:t>
+      </w:r>
+      <w:r>
+        <w:t xml:space="preserve">The data is complete above the</w:t>
+      </w:r>
+      <w:r>
+        <w:t xml:space="preserve"> </w:t>
+      </w:r>
+      <w:r>
+        <w:t xml:space="preserve">reporting threshold in each loss year’s</w:t>
+      </w:r>
+      <w:r>
+        <w:t xml:space="preserve"> </w:t>
+      </w:r>
+      <w:r>
+        <w:rPr>
+          <w:i/>
+          <w:iCs/>
+        </w:rPr>
+        <w:t xml:space="preserve">own</w:t>
+      </w:r>
+      <w:r>
+        <w:t xml:space="preserve"> </w:t>
+      </w:r>
+      <w:r>
+        <w:t xml:space="preserve">money. Once losses are indexed,</w:t>
+      </w:r>
+      <w:r>
+        <w:t xml:space="preserve"> </w:t>
+      </w:r>
+      <w:r>
+        <w:t xml:space="preserve">that guarantee only holds above the threshold indexed the same way, so the</w:t>
+      </w:r>
+      <w:r>
+        <w:t xml:space="preserve"> </w:t>
+      </w:r>
+      <w:r>
+        <w:t xml:space="preserve">floor for the modelling threshold is the reporting threshold times the largest</w:t>
+      </w:r>
+      <w:r>
+        <w:t xml:space="preserve"> </w:t>
+      </w:r>
+      <w:r>
+        <w:t xml:space="preserve">inflation factor across the observed years (with positive inflation, the</w:t>
+      </w:r>
+      <w:r>
+        <w:t xml:space="preserve"> </w:t>
+      </w:r>
+      <w:r>
+        <w:t xml:space="preserve">earliest year):</w:t>
+      </w:r>
+      <w:r>
+        <w:t xml:space="preserve"> </w:t>
+      </w:r>
+      <m:oMath>
+        <m:r>
+          <m:t>R</m:t>
+        </m:r>
+        <m:r>
+          <m:t>T</m:t>
+        </m:r>
+        <m:r>
+          <m:rPr>
+            <m:sty m:val="p"/>
+          </m:rPr>
+          <m:t>⋅</m:t>
+        </m:r>
+        <m:sSub>
+          <m:e>
+            <m:r>
+              <m:rPr>
+                <m:sty m:val="p"/>
+              </m:rPr>
+              <m:t>max</m:t>
+            </m:r>
+          </m:e>
+          <m:sub>
+            <m:r>
+              <m:t>y</m:t>
+            </m:r>
+          </m:sub>
+        </m:sSub>
+        <m:sSubSup>
+          <m:e>
+            <m:r>
+              <m:t>f</m:t>
+            </m:r>
+          </m:e>
+          <m:sub>
+            <m:r>
+              <m:t>y</m:t>
+            </m:r>
+          </m:sub>
+          <m:sup>
+            <m:r>
+              <m:t>i</m:t>
+            </m:r>
+            <m:r>
+              <m:t>n</m:t>
+            </m:r>
+            <m:r>
+              <m:t>f</m:t>
+            </m:r>
+            <m:r>
+              <m:t>l</m:t>
+            </m:r>
+          </m:sup>
+        </m:sSubSup>
+      </m:oMath>
+      <w:r>
+        <w:t xml:space="preserve">. Modelling below this floor</w:t>
+      </w:r>
+      <w:r>
+        <w:t xml:space="preserve"> </w:t>
+      </w:r>
+      <w:r>
+        <w:t xml:space="preserve">understates the frequency, because losses that would index above MT were never</w:t>
+      </w:r>
+      <w:r>
+        <w:t xml:space="preserve"> </w:t>
+      </w:r>
+      <w:r>
+        <w:t xml:space="preserve">recorded in the early years. This is</w:t>
+      </w:r>
+      <w:r>
+        <w:t xml:space="preserve"> </w:t>
+      </w:r>
+      <w:r>
+        <w:rPr>
+          <w:rStyle w:val="VerbatimChar"/>
+        </w:rPr>
+        <w:t xml:space="preserve">indexed_reporting_threshold</w:t>
+      </w:r>
+      <w:r>
+        <w:t xml:space="preserve"> </w:t>
+      </w:r>
+      <w:r>
+        <w:t xml:space="preserve">in</w:t>
+      </w:r>
+      <w:r>
+        <w:t xml:space="preserve"> </w:t>
+      </w:r>
+      <w:r>
+        <w:rPr>
+          <w:rStyle w:val="VerbatimChar"/>
+        </w:rPr>
+        <w:t xml:space="preserve">preprocess.R</w:t>
+      </w:r>
+      <w:r>
+        <w:t xml:space="preserve">; the dashboard clamps the modelling threshold to it, and the</w:t>
+      </w:r>
+      <w:r>
+        <w:t xml:space="preserve"> </w:t>
+      </w:r>
+      <w:r>
+        <w:t xml:space="preserve">headless path warns when a supplied threshold sits below it.</w:t>
+      </w:r>
+    </w:p>
+    <w:p>
+      <w:pPr>
+        <w:pStyle w:val="BodyText"/>
       </w:pPr>
       <w:r>
         <w:rPr>
@@ -4118,19 +4454,73 @@
         <w:t xml:space="preserve"> </w:t>
       </w:r>
       <w:r>
-        <w:t xml:space="preserve">are coherent). The user can choose one of three distributions; Poisson is the</w:t>
-      </w:r>
-      <w:r>
-        <w:t xml:space="preserve"> </w:t>
-      </w:r>
-      <w:r>
-        <w:t xml:space="preserve">principled default because reinsurance data is usually too sparse to select a</w:t>
-      </w:r>
-      <w:r>
-        <w:t xml:space="preserve"> </w:t>
-      </w:r>
-      <w:r>
-        <w:t xml:space="preserve">distribution class from the data alone.</w:t>
+        <w:t xml:space="preserve">are coherent). The observation window runs over the exposure years up to the</w:t>
+      </w:r>
+      <w:r>
+        <w:t xml:space="preserve"> </w:t>
+      </w:r>
+      <w:r>
+        <w:t xml:space="preserve">declared last complete experience year (</w:t>
+      </w:r>
+      <w:r>
+        <w:rPr>
+          <w:rStyle w:val="VerbatimChar"/>
+        </w:rPr>
+        <w:t xml:space="preserve">observation_years</w:t>
+      </w:r>
+      <w:r>
+        <w:t xml:space="preserve"> </w:t>
+      </w:r>
+      <w:r>
+        <w:t xml:space="preserve">in</w:t>
+      </w:r>
+      <w:r>
+        <w:t xml:space="preserve"> </w:t>
+      </w:r>
+      <w:r>
+        <w:rPr>
+          <w:rStyle w:val="VerbatimChar"/>
+        </w:rPr>
+        <w:t xml:space="preserve">preprocess.R</w:t>
+      </w:r>
+      <w:r>
+        <w:t xml:space="preserve">). When no such year is declared, the window ends at the latest</w:t>
+      </w:r>
+      <w:r>
+        <w:t xml:space="preserve"> </w:t>
+      </w:r>
+      <w:r>
+        <w:t xml:space="preserve">loss year; declaring it matters because the latest loss year is itself random:</w:t>
+      </w:r>
+      <w:r>
+        <w:t xml:space="preserve"> </w:t>
+      </w:r>
+      <w:r>
+        <w:t xml:space="preserve">a genuine zero-loss final year would otherwise be dropped (overstating the</w:t>
+      </w:r>
+      <w:r>
+        <w:t xml:space="preserve"> </w:t>
+      </w:r>
+      <w:r>
+        <w:t xml:space="preserve">frequency) and a partially observed final year would be counted in full</w:t>
+      </w:r>
+      <w:r>
+        <w:t xml:space="preserve"> </w:t>
+      </w:r>
+      <w:r>
+        <w:t xml:space="preserve">(understating it). The user can choose one of three distributions; Poisson is</w:t>
+      </w:r>
+      <w:r>
+        <w:t xml:space="preserve"> </w:t>
+      </w:r>
+      <w:r>
+        <w:t xml:space="preserve">the principled default because reinsurance data is usually too sparse to</w:t>
+      </w:r>
+      <w:r>
+        <w:t xml:space="preserve"> </w:t>
+      </w:r>
+      <w:r>
+        <w:t xml:space="preserve">select a distribution class from the data alone.</w:t>
       </w:r>
     </w:p>
     <w:p>
@@ -4701,31 +5091,44 @@
         <w:t xml:space="preserve"> </w:t>
       </w:r>
       <w:r>
-        <w:t xml:space="preserve">fitted by maximum</w:t>
-      </w:r>
-      <w:r>
-        <w:t xml:space="preserve"> </w:t>
-      </w:r>
-      <w:r>
-        <w:t xml:space="preserve">likelihood (via</w:t>
-      </w:r>
-      <w:r>
-        <w:t xml:space="preserve"> </w:t>
+        <w:t xml:space="preserve">fitted by</w:t>
+      </w:r>
+      <w:r>
+        <w:t xml:space="preserve"> </w:t>
+      </w:r>
+      <w:r>
+        <w:rPr>
+          <w:b/>
+          <w:bCs/>
+        </w:rPr>
+        <w:t xml:space="preserve">truncated</w:t>
+      </w:r>
+      <w:r>
+        <w:t xml:space="preserve"> </w:t>
+      </w:r>
+      <w:r>
+        <w:t xml:space="preserve">maximum likelihood on the indexed losses in that range</w:t>
+      </w:r>
+      <w:r>
+        <w:t xml:space="preserve"> </w:t>
+      </w:r>
+      <w:r>
+        <w:t xml:space="preserve">(</w:t>
       </w:r>
       <w:r>
         <w:rPr>
           <w:rStyle w:val="VerbatimChar"/>
         </w:rPr>
-        <w:t xml:space="preserve">fitdistrplus</w:t>
-      </w:r>
-      <w:r>
-        <w:t xml:space="preserve">) on the indexed losses in that range, used as a</w:t>
-      </w:r>
-      <w:r>
-        <w:t xml:space="preserve"> </w:t>
-      </w:r>
-      <w:r>
-        <w:t xml:space="preserve">lognormal truncated to</w:t>
+        <w:t xml:space="preserve">fit_lnorm_truncated</w:t>
+      </w:r>
+      <w:r>
+        <w:t xml:space="preserve">): the likelihood is that of the lognormal conditioned</w:t>
+      </w:r>
+      <w:r>
+        <w:t xml:space="preserve"> </w:t>
+      </w:r>
+      <w:r>
+        <w:t xml:space="preserve">to</w:t>
       </w:r>
       <w:r>
         <w:t xml:space="preserve"> </w:t>
@@ -4760,7 +5163,44 @@
         </m:r>
       </m:oMath>
       <w:r>
-        <w:t xml:space="preserve">.</w:t>
+        <w:t xml:space="preserve">, matching exactly how the body is used. An unconditional fit on</w:t>
+      </w:r>
+      <w:r>
+        <w:t xml:space="preserve"> </w:t>
+      </w:r>
+      <w:r>
+        <w:t xml:space="preserve">the windowed data would bias</w:t>
+      </w:r>
+      <w:r>
+        <w:t xml:space="preserve"> </w:t>
+      </w:r>
+      <m:oMath>
+        <m:r>
+          <m:t>μ</m:t>
+        </m:r>
+      </m:oMath>
+      <w:r>
+        <w:t xml:space="preserve"> </w:t>
+      </w:r>
+      <w:r>
+        <w:t xml:space="preserve">and</w:t>
+      </w:r>
+      <w:r>
+        <w:t xml:space="preserve"> </w:t>
+      </w:r>
+      <m:oMath>
+        <m:r>
+          <m:t>σ</m:t>
+        </m:r>
+      </m:oMath>
+      <w:r>
+        <w:t xml:space="preserve">, explaining the missing tails</w:t>
+      </w:r>
+      <w:r>
+        <w:t xml:space="preserve"> </w:t>
+      </w:r>
+      <w:r>
+        <w:t xml:space="preserve">as low variance.</w:t>
       </w:r>
     </w:p>
     <w:p>
@@ -4856,7 +5296,7 @@
         <w:t xml:space="preserve"> </w:t>
       </w:r>
       <w:r>
-        <w:t xml:space="preserve">estimated by maximum likelihood:</w:t>
+        <w:t xml:space="preserve">estimated by maximum likelihood with a small-sample bias correction:</w:t>
       </w:r>
     </w:p>
     <w:p>
@@ -4891,6 +5331,15 @@
             <m:num>
               <m:r>
                 <m:t>n</m:t>
+              </m:r>
+              <m:r>
+                <m:rPr>
+                  <m:sty m:val="p"/>
+                </m:rPr>
+                <m:t>−</m:t>
+              </m:r>
+              <m:r>
+                <m:t>1</m:t>
               </m:r>
             </m:num>
             <m:den>
@@ -4961,18 +5410,244 @@
         <w:pStyle w:val="FirstParagraph"/>
       </w:pPr>
       <w:r>
-        <w:t xml:space="preserve">over the losses above</w:t>
+        <w:t xml:space="preserve">over the</w:t>
       </w:r>
       <w:r>
         <w:t xml:space="preserve"> </w:t>
       </w:r>
       <m:oMath>
         <m:r>
+          <m:t>n</m:t>
+        </m:r>
+      </m:oMath>
+      <w:r>
+        <w:t xml:space="preserve"> </w:t>
+      </w:r>
+      <w:r>
+        <w:t xml:space="preserve">losses above</w:t>
+      </w:r>
+      <w:r>
+        <w:t xml:space="preserve"> </w:t>
+      </w:r>
+      <m:oMath>
+        <m:r>
           <m:t>s</m:t>
         </m:r>
       </m:oMath>
       <w:r>
-        <w:t xml:space="preserve">.</w:t>
+        <w:t xml:space="preserve">. The plain MLE</w:t>
+      </w:r>
+      <w:r>
+        <w:t xml:space="preserve"> </w:t>
+      </w:r>
+      <m:oMath>
+        <m:r>
+          <m:t>n</m:t>
+        </m:r>
+        <m:r>
+          <m:rPr>
+            <m:sty m:val="p"/>
+          </m:rPr>
+          <m:t>/</m:t>
+        </m:r>
+        <m:nary>
+          <m:naryPr>
+            <m:chr m:val="∑"/>
+            <m:limLoc m:val="undOvr"/>
+            <m:subHide m:val="off"/>
+            <m:supHide m:val="on"/>
+          </m:naryPr>
+          <m:sub>
+            <m:r>
+              <m:t>i</m:t>
+            </m:r>
+          </m:sub>
+          <m:sup>
+            <m:r>
+              <m:t>​</m:t>
+            </m:r>
+          </m:sup>
+          <m:e>
+            <m:r>
+              <m:rPr>
+                <m:sty m:val="p"/>
+              </m:rPr>
+              <m:t>log</m:t>
+            </m:r>
+          </m:e>
+        </m:nary>
+        <m:d>
+          <m:dPr>
+            <m:begChr m:val="("/>
+            <m:sepChr m:val=""/>
+            <m:endChr m:val=")"/>
+            <m:grow/>
+          </m:dPr>
+          <m:e>
+            <m:sSub>
+              <m:e>
+                <m:r>
+                  <m:t>x</m:t>
+                </m:r>
+              </m:e>
+              <m:sub>
+                <m:r>
+                  <m:t>i</m:t>
+                </m:r>
+              </m:sub>
+            </m:sSub>
+            <m:r>
+              <m:rPr>
+                <m:sty m:val="p"/>
+              </m:rPr>
+              <m:t>/</m:t>
+            </m:r>
+            <m:r>
+              <m:t>s</m:t>
+            </m:r>
+          </m:e>
+        </m:d>
+      </m:oMath>
+      <w:r>
+        <w:t xml:space="preserve"> </w:t>
+      </w:r>
+      <w:r>
+        <w:t xml:space="preserve">is</w:t>
+      </w:r>
+      <w:r>
+        <w:t xml:space="preserve"> </w:t>
+      </w:r>
+      <w:r>
+        <w:t xml:space="preserve">biased upward (its expectation is</w:t>
+      </w:r>
+      <w:r>
+        <w:t xml:space="preserve"> </w:t>
+      </w:r>
+      <m:oMath>
+        <m:r>
+          <m:t>α</m:t>
+        </m:r>
+        <m:r>
+          <m:rPr>
+            <m:sty m:val="p"/>
+          </m:rPr>
+          <m:t>⋅</m:t>
+        </m:r>
+        <m:r>
+          <m:t>n</m:t>
+        </m:r>
+        <m:r>
+          <m:rPr>
+            <m:sty m:val="p"/>
+          </m:rPr>
+          <m:t>/</m:t>
+        </m:r>
+        <m:d>
+          <m:dPr>
+            <m:begChr m:val="("/>
+            <m:sepChr m:val=""/>
+            <m:endChr m:val=")"/>
+            <m:grow/>
+          </m:dPr>
+          <m:e>
+            <m:r>
+              <m:t>n</m:t>
+            </m:r>
+            <m:r>
+              <m:rPr>
+                <m:sty m:val="p"/>
+              </m:rPr>
+              <m:t>−</m:t>
+            </m:r>
+            <m:r>
+              <m:t>1</m:t>
+            </m:r>
+          </m:e>
+        </m:d>
+      </m:oMath>
+      <w:r>
+        <w:t xml:space="preserve">), which understates</w:t>
+      </w:r>
+      <w:r>
+        <w:t xml:space="preserve"> </w:t>
+      </w:r>
+      <w:r>
+        <w:t xml:space="preserve">the tail exactly where reinsurance samples are thinnest; the</w:t>
+      </w:r>
+      <w:r>
+        <w:t xml:space="preserve"> </w:t>
+      </w:r>
+      <m:oMath>
+        <m:d>
+          <m:dPr>
+            <m:begChr m:val="("/>
+            <m:sepChr m:val=""/>
+            <m:endChr m:val=")"/>
+            <m:grow/>
+          </m:dPr>
+          <m:e>
+            <m:r>
+              <m:t>n</m:t>
+            </m:r>
+            <m:r>
+              <m:rPr>
+                <m:sty m:val="p"/>
+              </m:rPr>
+              <m:t>−</m:t>
+            </m:r>
+            <m:r>
+              <m:t>1</m:t>
+            </m:r>
+          </m:e>
+        </m:d>
+        <m:r>
+          <m:rPr>
+            <m:sty m:val="p"/>
+          </m:rPr>
+          <m:t>/</m:t>
+        </m:r>
+        <m:r>
+          <m:t>n</m:t>
+        </m:r>
+      </m:oMath>
+      <w:r>
+        <w:t xml:space="preserve"> </w:t>
+      </w:r>
+      <w:r>
+        <w:t xml:space="preserve">factor</w:t>
+      </w:r>
+      <w:r>
+        <w:t xml:space="preserve"> </w:t>
+      </w:r>
+      <w:r>
+        <w:t xml:space="preserve">removes that bias. The correction can be switched off in the dashboard (or via</w:t>
+      </w:r>
+      <w:r>
+        <w:t xml:space="preserve"> </w:t>
+      </w:r>
+      <w:r>
+        <w:t xml:space="preserve">the</w:t>
+      </w:r>
+      <w:r>
+        <w:t xml:space="preserve"> </w:t>
+      </w:r>
+      <w:r>
+        <w:rPr>
+          <w:rStyle w:val="VerbatimChar"/>
+        </w:rPr>
+        <w:t xml:space="preserve">pareto_bias_correction</w:t>
+      </w:r>
+      <w:r>
+        <w:t xml:space="preserve"> </w:t>
+      </w:r>
+      <w:r>
+        <w:t xml:space="preserve">setting) to reproduce the plain MLE used in the</w:t>
+      </w:r>
+      <w:r>
+        <w:t xml:space="preserve"> </w:t>
+      </w:r>
+      <w:r>
+        <w:t xml:space="preserve">Reinsurance Analytics notes; with a single tail loss the plain MLE is kept.</w:t>
       </w:r>
     </w:p>
     <w:p>
@@ -7032,6 +7707,39 @@
         </m:oMath>
       </m:oMathPara>
     </w:p>
+    <w:p>
+      <w:pPr>
+        <w:pStyle w:val="FirstParagraph"/>
+      </w:pPr>
+      <w:r>
+        <w:t xml:space="preserve">Both are</w:t>
+      </w:r>
+      <w:r>
+        <w:t xml:space="preserve"> </w:t>
+      </w:r>
+      <w:r>
+        <w:rPr>
+          <w:b/>
+          <w:bCs/>
+        </w:rPr>
+        <w:t xml:space="preserve">pure technical premiums</w:t>
+      </w:r>
+      <w:r>
+        <w:t xml:space="preserve">: the loading is a risk margin only, with</w:t>
+      </w:r>
+      <w:r>
+        <w:t xml:space="preserve"> </w:t>
+      </w:r>
+      <w:r>
+        <w:t xml:space="preserve">no allowance for expenses, brokerage, or cost of capital. A market premium</w:t>
+      </w:r>
+      <w:r>
+        <w:t xml:space="preserve"> </w:t>
+      </w:r>
+      <w:r>
+        <w:t xml:space="preserve">would sit above these figures.</w:t>
+      </w:r>
+    </w:p>
     <w:bookmarkEnd w:id="35"/>
     <w:bookmarkStart w:id="36" w:name="validation-an-independent-oracle"/>
     <w:p>
@@ -7291,7 +7999,100 @@
         <w:t xml:space="preserve"> </w:t>
       </w:r>
       <w:r>
-        <w:t xml:space="preserve">Validation table shows both and their difference per layer.</w:t>
+        <w:t xml:space="preserve">Validation table shows both and their difference per layer, together with the</w:t>
+      </w:r>
+      <w:r>
+        <w:t xml:space="preserve"> </w:t>
+      </w:r>
+      <w:r>
+        <w:rPr>
+          <w:b/>
+          <w:bCs/>
+        </w:rPr>
+        <w:t xml:space="preserve">Monte Carlo standard error</w:t>
+      </w:r>
+      <w:r>
+        <w:t xml:space="preserve"> </w:t>
+      </w:r>
+      <m:oMath>
+        <m:r>
+          <m:rPr>
+            <m:sty m:val="p"/>
+          </m:rPr>
+          <m:t>s</m:t>
+        </m:r>
+        <m:r>
+          <m:rPr>
+            <m:sty m:val="p"/>
+          </m:rPr>
+          <m:t>d</m:t>
+        </m:r>
+        <m:d>
+          <m:dPr>
+            <m:begChr m:val="["/>
+            <m:sepChr m:val=""/>
+            <m:endChr m:val="]"/>
+            <m:grow/>
+          </m:dPr>
+          <m:e>
+            <m:r>
+              <m:t>L</m:t>
+            </m:r>
+          </m:e>
+        </m:d>
+        <m:r>
+          <m:rPr>
+            <m:sty m:val="p"/>
+          </m:rPr>
+          <m:t>/</m:t>
+        </m:r>
+        <m:rad>
+          <m:radPr>
+            <m:degHide m:val="on"/>
+          </m:radPr>
+          <m:deg/>
+          <m:e>
+            <m:sSub>
+              <m:e>
+                <m:r>
+                  <m:t>n</m:t>
+                </m:r>
+              </m:e>
+              <m:sub>
+                <m:r>
+                  <m:t>s</m:t>
+                </m:r>
+                <m:r>
+                  <m:t>i</m:t>
+                </m:r>
+                <m:r>
+                  <m:t>m</m:t>
+                </m:r>
+                <m:r>
+                  <m:t>s</m:t>
+                </m:r>
+              </m:sub>
+            </m:sSub>
+          </m:e>
+        </m:rad>
+      </m:oMath>
+      <w:r>
+        <w:t xml:space="preserve"> </w:t>
+      </w:r>
+      <w:r>
+        <w:t xml:space="preserve">as the</w:t>
+      </w:r>
+      <w:r>
+        <w:t xml:space="preserve"> </w:t>
+      </w:r>
+      <w:r>
+        <w:t xml:space="preserve">yardstick for that difference: a delta within about two standard errors is</w:t>
+      </w:r>
+      <w:r>
+        <w:t xml:space="preserve"> </w:t>
+      </w:r>
+      <w:r>
+        <w:t xml:space="preserve">simulation noise, a larger one is worth investigating.</w:t>
       </w:r>
     </w:p>
     <w:p>

</xml_diff>

<commit_message>
Remove the Pareto alpha bias correction
Reverts the (n - 1)/n small-sample correction: it added complexity that
is not justified for this tool, and the plain MLE keeps the method
aligned with the Reinsurance Analytics notes. The review records the
bias as a known, accepted limitation.

Co-Authored-By: Claude Fable 5 <noreply@anthropic.com>
</commit_message>
<xml_diff>
--- a/Technical documentation.docx
+++ b/Technical documentation.docx
@@ -2007,13 +2007,7 @@
         <w:t xml:space="preserve"> </w:t>
       </w:r>
       <w:r>
-        <w:t xml:space="preserve">splice threshold, frequency model, Pareto bias correction, simulations,</w:t>
-      </w:r>
-      <w:r>
-        <w:t xml:space="preserve"> </w:t>
-      </w:r>
-      <w:r>
-        <w:t xml:space="preserve">loadings, VaR level). When</w:t>
+        <w:t xml:space="preserve">splice threshold, frequency model, simulations, loadings, VaR level). When</w:t>
       </w:r>
       <w:r>
         <w:t xml:space="preserve"> </w:t>
@@ -5296,7 +5290,7 @@
         <w:t xml:space="preserve"> </w:t>
       </w:r>
       <w:r>
-        <w:t xml:space="preserve">estimated by maximum likelihood with a small-sample bias correction:</w:t>
+        <w:t xml:space="preserve">estimated by maximum likelihood:</w:t>
       </w:r>
     </w:p>
     <w:p>
@@ -5331,15 +5325,6 @@
             <m:num>
               <m:r>
                 <m:t>n</m:t>
-              </m:r>
-              <m:r>
-                <m:rPr>
-                  <m:sty m:val="p"/>
-                </m:rPr>
-                <m:t>−</m:t>
-              </m:r>
-              <m:r>
-                <m:t>1</m:t>
               </m:r>
             </m:num>
             <m:den>
@@ -5435,219 +5420,25 @@
         </m:r>
       </m:oMath>
       <w:r>
-        <w:t xml:space="preserve">. The plain MLE</w:t>
-      </w:r>
-      <w:r>
-        <w:t xml:space="preserve"> </w:t>
-      </w:r>
-      <m:oMath>
-        <m:r>
-          <m:t>n</m:t>
-        </m:r>
-        <m:r>
-          <m:rPr>
-            <m:sty m:val="p"/>
-          </m:rPr>
-          <m:t>/</m:t>
-        </m:r>
-        <m:nary>
-          <m:naryPr>
-            <m:chr m:val="∑"/>
-            <m:limLoc m:val="undOvr"/>
-            <m:subHide m:val="off"/>
-            <m:supHide m:val="on"/>
-          </m:naryPr>
-          <m:sub>
-            <m:r>
-              <m:t>i</m:t>
-            </m:r>
-          </m:sub>
-          <m:sup>
-            <m:r>
-              <m:t>​</m:t>
-            </m:r>
-          </m:sup>
-          <m:e>
-            <m:r>
-              <m:rPr>
-                <m:sty m:val="p"/>
-              </m:rPr>
-              <m:t>log</m:t>
-            </m:r>
-          </m:e>
-        </m:nary>
-        <m:d>
-          <m:dPr>
-            <m:begChr m:val="("/>
-            <m:sepChr m:val=""/>
-            <m:endChr m:val=")"/>
-            <m:grow/>
-          </m:dPr>
-          <m:e>
-            <m:sSub>
-              <m:e>
-                <m:r>
-                  <m:t>x</m:t>
-                </m:r>
-              </m:e>
-              <m:sub>
-                <m:r>
-                  <m:t>i</m:t>
-                </m:r>
-              </m:sub>
-            </m:sSub>
-            <m:r>
-              <m:rPr>
-                <m:sty m:val="p"/>
-              </m:rPr>
-              <m:t>/</m:t>
-            </m:r>
-            <m:r>
-              <m:t>s</m:t>
-            </m:r>
-          </m:e>
-        </m:d>
-      </m:oMath>
-      <w:r>
-        <w:t xml:space="preserve"> </w:t>
-      </w:r>
-      <w:r>
-        <w:t xml:space="preserve">is</w:t>
-      </w:r>
-      <w:r>
-        <w:t xml:space="preserve"> </w:t>
-      </w:r>
-      <w:r>
-        <w:t xml:space="preserve">biased upward (its expectation is</w:t>
-      </w:r>
-      <w:r>
-        <w:t xml:space="preserve"> </w:t>
-      </w:r>
-      <m:oMath>
-        <m:r>
-          <m:t>α</m:t>
-        </m:r>
-        <m:r>
-          <m:rPr>
-            <m:sty m:val="p"/>
-          </m:rPr>
-          <m:t>⋅</m:t>
-        </m:r>
-        <m:r>
-          <m:t>n</m:t>
-        </m:r>
-        <m:r>
-          <m:rPr>
-            <m:sty m:val="p"/>
-          </m:rPr>
-          <m:t>/</m:t>
-        </m:r>
-        <m:d>
-          <m:dPr>
-            <m:begChr m:val="("/>
-            <m:sepChr m:val=""/>
-            <m:endChr m:val=")"/>
-            <m:grow/>
-          </m:dPr>
-          <m:e>
-            <m:r>
-              <m:t>n</m:t>
-            </m:r>
-            <m:r>
-              <m:rPr>
-                <m:sty m:val="p"/>
-              </m:rPr>
-              <m:t>−</m:t>
-            </m:r>
-            <m:r>
-              <m:t>1</m:t>
-            </m:r>
-          </m:e>
-        </m:d>
-      </m:oMath>
-      <w:r>
-        <w:t xml:space="preserve">), which understates</w:t>
-      </w:r>
-      <w:r>
-        <w:t xml:space="preserve"> </w:t>
-      </w:r>
-      <w:r>
-        <w:t xml:space="preserve">the tail exactly where reinsurance samples are thinnest; the</w:t>
-      </w:r>
-      <w:r>
-        <w:t xml:space="preserve"> </w:t>
-      </w:r>
-      <m:oMath>
-        <m:d>
-          <m:dPr>
-            <m:begChr m:val="("/>
-            <m:sepChr m:val=""/>
-            <m:endChr m:val=")"/>
-            <m:grow/>
-          </m:dPr>
-          <m:e>
-            <m:r>
-              <m:t>n</m:t>
-            </m:r>
-            <m:r>
-              <m:rPr>
-                <m:sty m:val="p"/>
-              </m:rPr>
-              <m:t>−</m:t>
-            </m:r>
-            <m:r>
-              <m:t>1</m:t>
-            </m:r>
-          </m:e>
-        </m:d>
-        <m:r>
-          <m:rPr>
-            <m:sty m:val="p"/>
-          </m:rPr>
-          <m:t>/</m:t>
-        </m:r>
-        <m:r>
-          <m:t>n</m:t>
-        </m:r>
-      </m:oMath>
-      <w:r>
-        <w:t xml:space="preserve"> </w:t>
-      </w:r>
-      <w:r>
-        <w:t xml:space="preserve">factor</w:t>
-      </w:r>
-      <w:r>
-        <w:t xml:space="preserve"> </w:t>
-      </w:r>
-      <w:r>
-        <w:t xml:space="preserve">removes that bias. The correction can be switched off in the dashboard (or via</w:t>
-      </w:r>
-      <w:r>
-        <w:t xml:space="preserve"> </w:t>
-      </w:r>
-      <w:r>
-        <w:t xml:space="preserve">the</w:t>
-      </w:r>
-      <w:r>
-        <w:t xml:space="preserve"> </w:t>
-      </w:r>
-      <w:r>
-        <w:rPr>
-          <w:rStyle w:val="VerbatimChar"/>
-        </w:rPr>
-        <w:t xml:space="preserve">pareto_bias_correction</w:t>
-      </w:r>
-      <w:r>
-        <w:t xml:space="preserve"> </w:t>
-      </w:r>
-      <w:r>
-        <w:t xml:space="preserve">setting) to reproduce the plain MLE used in the</w:t>
-      </w:r>
-      <w:r>
-        <w:t xml:space="preserve"> </w:t>
-      </w:r>
-      <w:r>
-        <w:t xml:space="preserve">Reinsurance Analytics notes; with a single tail loss the plain MLE is kept.</w:t>
+        <w:t xml:space="preserve">, matching the estimator in the Reinsurance</w:t>
+      </w:r>
+      <w:r>
+        <w:t xml:space="preserve"> </w:t>
+      </w:r>
+      <w:r>
+        <w:t xml:space="preserve">Analytics notes. (The MLE is known to be biased upward in small samples; a</w:t>
+      </w:r>
+      <w:r>
+        <w:t xml:space="preserve"> </w:t>
+      </w:r>
+      <w:r>
+        <w:t xml:space="preserve">correction was considered and deliberately left out to keep the method simple</w:t>
+      </w:r>
+      <w:r>
+        <w:t xml:space="preserve"> </w:t>
+      </w:r>
+      <w:r>
+        <w:t xml:space="preserve">and aligned with the notes.)</w:t>
       </w:r>
     </w:p>
     <w:p>

</xml_diff>

<commit_message>
Remove the Monte Carlo standard error from the validation table
At the default simulation count the Monte Carlo noise is negligible
next to the parameter uncertainty from fitting a handful of losses, so
the column suggested precision the price does not have. The delta
against the closed form stays as the bug check.

Co-Authored-By: Claude Fable 5 <noreply@anthropic.com>
</commit_message>
<xml_diff>
--- a/Technical documentation.docx
+++ b/Technical documentation.docx
@@ -2755,7 +2755,7 @@
         <w:t xml:space="preserve"> </w:t>
       </w:r>
       <w:r>
-        <w:t xml:space="preserve">delta, the Monte Carlo standard error, and the burning cost benchmark.</w:t>
+        <w:t xml:space="preserve">delta, and the burning cost benchmark.</w:t>
       </w:r>
     </w:p>
     <w:p>
@@ -7790,100 +7790,31 @@
         <w:t xml:space="preserve"> </w:t>
       </w:r>
       <w:r>
-        <w:t xml:space="preserve">Validation table shows both and their difference per layer, together with the</w:t>
-      </w:r>
-      <w:r>
-        <w:t xml:space="preserve"> </w:t>
-      </w:r>
-      <w:r>
-        <w:rPr>
-          <w:b/>
-          <w:bCs/>
-        </w:rPr>
-        <w:t xml:space="preserve">Monte Carlo standard error</w:t>
-      </w:r>
-      <w:r>
-        <w:t xml:space="preserve"> </w:t>
-      </w:r>
-      <m:oMath>
-        <m:r>
-          <m:rPr>
-            <m:sty m:val="p"/>
-          </m:rPr>
-          <m:t>s</m:t>
-        </m:r>
-        <m:r>
-          <m:rPr>
-            <m:sty m:val="p"/>
-          </m:rPr>
-          <m:t>d</m:t>
-        </m:r>
-        <m:d>
-          <m:dPr>
-            <m:begChr m:val="["/>
-            <m:sepChr m:val=""/>
-            <m:endChr m:val="]"/>
-            <m:grow/>
-          </m:dPr>
-          <m:e>
-            <m:r>
-              <m:t>L</m:t>
-            </m:r>
-          </m:e>
-        </m:d>
-        <m:r>
-          <m:rPr>
-            <m:sty m:val="p"/>
-          </m:rPr>
-          <m:t>/</m:t>
-        </m:r>
-        <m:rad>
-          <m:radPr>
-            <m:degHide m:val="on"/>
-          </m:radPr>
-          <m:deg/>
-          <m:e>
-            <m:sSub>
-              <m:e>
-                <m:r>
-                  <m:t>n</m:t>
-                </m:r>
-              </m:e>
-              <m:sub>
-                <m:r>
-                  <m:t>s</m:t>
-                </m:r>
-                <m:r>
-                  <m:t>i</m:t>
-                </m:r>
-                <m:r>
-                  <m:t>m</m:t>
-                </m:r>
-                <m:r>
-                  <m:t>s</m:t>
-                </m:r>
-              </m:sub>
-            </m:sSub>
-          </m:e>
-        </m:rad>
-      </m:oMath>
-      <w:r>
-        <w:t xml:space="preserve"> </w:t>
-      </w:r>
-      <w:r>
-        <w:t xml:space="preserve">as the</w:t>
-      </w:r>
-      <w:r>
-        <w:t xml:space="preserve"> </w:t>
-      </w:r>
-      <w:r>
-        <w:t xml:space="preserve">yardstick for that difference: a delta within about two standard errors is</w:t>
-      </w:r>
-      <w:r>
-        <w:t xml:space="preserve"> </w:t>
-      </w:r>
-      <w:r>
-        <w:t xml:space="preserve">simulation noise, a larger one is worth investigating.</w:t>
+        <w:t xml:space="preserve">Validation table shows both and their difference per layer. Small differences</w:t>
+      </w:r>
+      <w:r>
+        <w:t xml:space="preserve"> </w:t>
+      </w:r>
+      <w:r>
+        <w:t xml:space="preserve">are expected: they are simulation noise, and they shrink as the number of</w:t>
+      </w:r>
+      <w:r>
+        <w:t xml:space="preserve"> </w:t>
+      </w:r>
+      <w:r>
+        <w:t xml:space="preserve">simulations grows. At the default 100,000 simulations that noise is negligible</w:t>
+      </w:r>
+      <w:r>
+        <w:t xml:space="preserve"> </w:t>
+      </w:r>
+      <w:r>
+        <w:t xml:space="preserve">next to the real uncertainty in the price, which comes from fitting a handful</w:t>
+      </w:r>
+      <w:r>
+        <w:t xml:space="preserve"> </w:t>
+      </w:r>
+      <w:r>
+        <w:t xml:space="preserve">of losses, so the delta is a bug check, not an uncertainty measure.</w:t>
       </w:r>
     </w:p>
     <w:p>

</xml_diff>

<commit_message>
Update docs for the RStudio launcher rename and release workflow
Document Start in RStudio.R in the README and technical docs, fix
comments referencing its old name, and add the dist/ ignore and
Releases pointer.
</commit_message>
<xml_diff>
--- a/Technical documentation.docx
+++ b/Technical documentation.docx
@@ -971,6 +971,137 @@
         <w:t xml:space="preserve">explaining what to do rather than failing silently.</w:t>
       </w:r>
     </w:p>
+    <w:p>
+      <w:pPr>
+        <w:pStyle w:val="BodyText"/>
+      </w:pPr>
+      <w:r>
+        <w:t xml:space="preserve">Some company computers block script files (</w:t>
+      </w:r>
+      <w:r>
+        <w:rPr>
+          <w:rStyle w:val="VerbatimChar"/>
+        </w:rPr>
+        <w:t xml:space="preserve">.vbs</w:t>
+      </w:r>
+      <w:r>
+        <w:t xml:space="preserve"> </w:t>
+      </w:r>
+      <w:r>
+        <w:t xml:space="preserve">and</w:t>
+      </w:r>
+      <w:r>
+        <w:t xml:space="preserve"> </w:t>
+      </w:r>
+      <w:r>
+        <w:rPr>
+          <w:rStyle w:val="VerbatimChar"/>
+        </w:rPr>
+        <w:t xml:space="preserve">.bat</w:t>
+      </w:r>
+      <w:r>
+        <w:t xml:space="preserve">) outright, so</w:t>
+      </w:r>
+      <w:r>
+        <w:t xml:space="preserve"> </w:t>
+      </w:r>
+      <w:r>
+        <w:t xml:space="preserve">double-clicking</w:t>
+      </w:r>
+      <w:r>
+        <w:t xml:space="preserve"> </w:t>
+      </w:r>
+      <w:r>
+        <w:rPr>
+          <w:rStyle w:val="VerbatimChar"/>
+        </w:rPr>
+        <w:t xml:space="preserve">start.vbs</w:t>
+      </w:r>
+      <w:r>
+        <w:t xml:space="preserve"> </w:t>
+      </w:r>
+      <w:r>
+        <w:t xml:space="preserve">does nothing.</w:t>
+      </w:r>
+      <w:r>
+        <w:t xml:space="preserve"> </w:t>
+      </w:r>
+      <w:r>
+        <w:rPr>
+          <w:rStyle w:val="VerbatimChar"/>
+        </w:rPr>
+        <w:t xml:space="preserve">Start in RStudio.R</w:t>
+      </w:r>
+      <w:r>
+        <w:t xml:space="preserve">, in the same top</w:t>
+      </w:r>
+      <w:r>
+        <w:t xml:space="preserve"> </w:t>
+      </w:r>
+      <w:r>
+        <w:t xml:space="preserve">folder, is the fallback for that case: open it in RStudio and click Source (or</w:t>
+      </w:r>
+      <w:r>
+        <w:t xml:space="preserve"> </w:t>
+      </w:r>
+      <w:r>
+        <w:t xml:space="preserve">press Ctrl+Shift+S). It does the same job as</w:t>
+      </w:r>
+      <w:r>
+        <w:t xml:space="preserve"> </w:t>
+      </w:r>
+      <w:r>
+        <w:rPr>
+          <w:rStyle w:val="VerbatimChar"/>
+        </w:rPr>
+        <w:t xml:space="preserve">start.vbs</w:t>
+      </w:r>
+      <w:r>
+        <w:t xml:space="preserve">, just launched through</w:t>
+      </w:r>
+      <w:r>
+        <w:t xml:space="preserve"> </w:t>
+      </w:r>
+      <w:r>
+        <w:t xml:space="preserve">R itself rather than a script file, which those blocks do not touch. It finds</w:t>
+      </w:r>
+      <w:r>
+        <w:t xml:space="preserve"> </w:t>
+      </w:r>
+      <w:r>
+        <w:t xml:space="preserve">the</w:t>
+      </w:r>
+      <w:r>
+        <w:t xml:space="preserve"> </w:t>
+      </w:r>
+      <w:r>
+        <w:rPr>
+          <w:rStyle w:val="VerbatimChar"/>
+        </w:rPr>
+        <w:t xml:space="preserve">engine</w:t>
+      </w:r>
+      <w:r>
+        <w:t xml:space="preserve"> </w:t>
+      </w:r>
+      <w:r>
+        <w:t xml:space="preserve">folder next to itself, installs any missing packages the same way</w:t>
+      </w:r>
+      <w:r>
+        <w:t xml:space="preserve"> </w:t>
+      </w:r>
+      <w:r>
+        <w:rPr>
+          <w:rStyle w:val="VerbatimChar"/>
+        </w:rPr>
+        <w:t xml:space="preserve">install_deps.R</w:t>
+      </w:r>
+      <w:r>
+        <w:t xml:space="preserve"> </w:t>
+      </w:r>
+      <w:r>
+        <w:t xml:space="preserve">does, and opens the dashboard in the browser.</w:t>
+      </w:r>
+    </w:p>
     <w:bookmarkEnd w:id="24"/>
     <w:bookmarkStart w:id="25" w:name="project-layout"/>
     <w:p>
@@ -1083,6 +1214,57 @@
               <w:rPr>
                 <w:rStyle w:val="VerbatimChar"/>
               </w:rPr>
+              <w:t xml:space="preserve">Start in RStudio.R</w:t>
+            </w:r>
+          </w:p>
+        </w:tc>
+        <w:tc>
+          <w:tcPr/>
+          <w:p>
+            <w:pPr>
+              <w:pStyle w:val="Compact"/>
+            </w:pPr>
+            <w:r>
+              <w:t xml:space="preserve">Fallback launcher for when</w:t>
+            </w:r>
+            <w:r>
+              <w:t xml:space="preserve"> </w:t>
+            </w:r>
+            <w:r>
+              <w:rPr>
+                <w:rStyle w:val="VerbatimChar"/>
+              </w:rPr>
+              <w:t xml:space="preserve">.vbs</w:t>
+            </w:r>
+            <w:r>
+              <w:t xml:space="preserve">/</w:t>
+            </w:r>
+            <w:r>
+              <w:rPr>
+                <w:rStyle w:val="VerbatimChar"/>
+              </w:rPr>
+              <w:t xml:space="preserve">.bat</w:t>
+            </w:r>
+            <w:r>
+              <w:t xml:space="preserve"> </w:t>
+            </w:r>
+            <w:r>
+              <w:t xml:space="preserve">files are blocked; run from inside RStudio.</w:t>
+            </w:r>
+          </w:p>
+        </w:tc>
+      </w:tr>
+      <w:tr>
+        <w:tc>
+          <w:tcPr/>
+          <w:p>
+            <w:pPr>
+              <w:pStyle w:val="Compact"/>
+            </w:pPr>
+            <w:r>
+              <w:rPr>
+                <w:rStyle w:val="VerbatimChar"/>
+              </w:rPr>
               <w:t xml:space="preserve">input.xlsx</w:t>
             </w:r>
           </w:p>
@@ -1411,7 +1593,58 @@
         <w:t xml:space="preserve"> </w:t>
       </w:r>
       <w:r>
-        <w:t xml:space="preserve">No commands and no R knowledge are required.</w:t>
+        <w:t xml:space="preserve">No commands and no R knowledge are required. If</w:t>
+      </w:r>
+      <w:r>
+        <w:t xml:space="preserve"> </w:t>
+      </w:r>
+      <w:r>
+        <w:rPr>
+          <w:rStyle w:val="VerbatimChar"/>
+        </w:rPr>
+        <w:t xml:space="preserve">.vbs</w:t>
+      </w:r>
+      <w:r>
+        <w:t xml:space="preserve">/</w:t>
+      </w:r>
+      <w:r>
+        <w:rPr>
+          <w:rStyle w:val="VerbatimChar"/>
+        </w:rPr>
+        <w:t xml:space="preserve">.bat</w:t>
+      </w:r>
+      <w:r>
+        <w:t xml:space="preserve"> </w:t>
+      </w:r>
+      <w:r>
+        <w:t xml:space="preserve">files are blocked</w:t>
+      </w:r>
+      <w:r>
+        <w:t xml:space="preserve"> </w:t>
+      </w:r>
+      <w:r>
+        <w:t xml:space="preserve">on the machine, open</w:t>
+      </w:r>
+      <w:r>
+        <w:t xml:space="preserve"> </w:t>
+      </w:r>
+      <w:r>
+        <w:rPr>
+          <w:rStyle w:val="VerbatimChar"/>
+        </w:rPr>
+        <w:t xml:space="preserve">Start in RStudio.R</w:t>
+      </w:r>
+      <w:r>
+        <w:t xml:space="preserve"> </w:t>
+      </w:r>
+      <w:r>
+        <w:t xml:space="preserve">in RStudio and click Source instead;</w:t>
+      </w:r>
+      <w:r>
+        <w:t xml:space="preserve"> </w:t>
+      </w:r>
+      <w:r>
+        <w:t xml:space="preserve">it does the same job through R rather than a script file.</w:t>
       </w:r>
     </w:p>
     <w:p>

</xml_diff>

<commit_message>
Clarify that developer commands need the source repo, not the release zip
The release zip leaves out the test suite on purpose, so note that
running it needs a full git checkout instead of the downloaded zip.
</commit_message>
<xml_diff>
--- a/Technical documentation.docx
+++ b/Technical documentation.docx
@@ -1652,13 +1652,25 @@
         <w:pStyle w:val="BodyText"/>
       </w:pPr>
       <w:r>
-        <w:t xml:space="preserve">The rest of this section is for developers and advanced use only. These commands</w:t>
-      </w:r>
-      <w:r>
-        <w:t xml:space="preserve"> </w:t>
-      </w:r>
-      <w:r>
-        <w:t xml:space="preserve">all run from inside the</w:t>
+        <w:t xml:space="preserve">The rest of this section is for developers and advanced use only, and needs</w:t>
+      </w:r>
+      <w:r>
+        <w:t xml:space="preserve"> </w:t>
+      </w:r>
+      <w:r>
+        <w:t xml:space="preserve">the full source repository, not the release zip, since the release zip only</w:t>
+      </w:r>
+      <w:r>
+        <w:t xml:space="preserve"> </w:t>
+      </w:r>
+      <w:r>
+        <w:t xml:space="preserve">ships what an end user needs to run the tool and leaves out the test suite</w:t>
+      </w:r>
+      <w:r>
+        <w:t xml:space="preserve"> </w:t>
+      </w:r>
+      <w:r>
+        <w:t xml:space="preserve">and other developer-only files. These commands all run from inside the</w:t>
       </w:r>
       <w:r>
         <w:t xml:space="preserve"> </w:t>
@@ -1747,7 +1759,46 @@
         <w:t xml:space="preserve">Rscript run_tests.R</w:t>
       </w:r>
       <w:r>
-        <w:t xml:space="preserve">.</w:t>
+        <w:t xml:space="preserve"> </w:t>
+      </w:r>
+      <w:r>
+        <w:t xml:space="preserve">(requires the</w:t>
+      </w:r>
+      <w:r>
+        <w:t xml:space="preserve"> </w:t>
+      </w:r>
+      <w:r>
+        <w:rPr>
+          <w:rStyle w:val="VerbatimChar"/>
+        </w:rPr>
+        <w:t xml:space="preserve">testthat</w:t>
+      </w:r>
+      <w:r>
+        <w:t xml:space="preserve"> </w:t>
+      </w:r>
+      <w:r>
+        <w:t xml:space="preserve">package, and the</w:t>
+      </w:r>
+      <w:r>
+        <w:t xml:space="preserve"> </w:t>
+      </w:r>
+      <w:r>
+        <w:rPr>
+          <w:rStyle w:val="VerbatimChar"/>
+        </w:rPr>
+        <w:t xml:space="preserve">engine/tests/</w:t>
+      </w:r>
+      <w:r>
+        <w:t xml:space="preserve"> </w:t>
+      </w:r>
+      <w:r>
+        <w:t xml:space="preserve">folder, which is only in the source</w:t>
+      </w:r>
+      <w:r>
+        <w:t xml:space="preserve"> </w:t>
+      </w:r>
+      <w:r>
+        <w:t xml:space="preserve">repository).</w:t>
       </w:r>
     </w:p>
     <w:p>

</xml_diff>

<commit_message>
Remove headless pricing instructions, fix stale test and launch docs
Drop the "price without the UI" instructions from README, CLAUDE.md,
and documentation.md so nobody is pointed at something not meant to be
a supported path. Also fix two audit findings: the release zip leaves
out the test suite, and Rscript needs launch.browser = TRUE to open a
browser tab since it is not an interactive session.
</commit_message>
<xml_diff>
--- a/Technical documentation.docx
+++ b/Technical documentation.docx
@@ -1710,7 +1710,7 @@
         <w:rPr>
           <w:rStyle w:val="VerbatimChar"/>
         </w:rPr>
-        <w:t xml:space="preserve">Rscript -e "shiny::runApp('.')"</w:t>
+        <w:t xml:space="preserve">Rscript -e "shiny::runApp('.', launch.browser = TRUE)"</w:t>
       </w:r>
       <w:r>
         <w:t xml:space="preserve"> </w:t>
@@ -1732,6 +1732,48 @@
       </w:r>
       <w:r>
         <w:t xml:space="preserve">in RStudio and click Run App).</w:t>
+      </w:r>
+      <w:r>
+        <w:t xml:space="preserve"> </w:t>
+      </w:r>
+      <w:r>
+        <w:rPr>
+          <w:rStyle w:val="VerbatimChar"/>
+        </w:rPr>
+        <w:t xml:space="preserve">launch.browser = TRUE</w:t>
+      </w:r>
+      <w:r>
+        <w:t xml:space="preserve"> </w:t>
+      </w:r>
+      <w:r>
+        <w:t xml:space="preserve">is</w:t>
+      </w:r>
+      <w:r>
+        <w:t xml:space="preserve"> </w:t>
+      </w:r>
+      <w:r>
+        <w:t xml:space="preserve">needed here because Shiny only opens a browser tab on its own in an</w:t>
+      </w:r>
+      <w:r>
+        <w:t xml:space="preserve"> </w:t>
+      </w:r>
+      <w:r>
+        <w:t xml:space="preserve">interactive session, and</w:t>
+      </w:r>
+      <w:r>
+        <w:t xml:space="preserve"> </w:t>
+      </w:r>
+      <w:r>
+        <w:rPr>
+          <w:rStyle w:val="VerbatimChar"/>
+        </w:rPr>
+        <w:t xml:space="preserve">Rscript</w:t>
+      </w:r>
+      <w:r>
+        <w:t xml:space="preserve"> </w:t>
+      </w:r>
+      <w:r>
+        <w:t xml:space="preserve">is not interactive.</w:t>
       </w:r>
     </w:p>
     <w:p>
@@ -1799,61 +1841,6 @@
       </w:r>
       <w:r>
         <w:t xml:space="preserve">repository).</w:t>
-      </w:r>
-    </w:p>
-    <w:p>
-      <w:pPr>
-        <w:pStyle w:val="Compact"/>
-        <w:numPr>
-          <w:ilvl w:val="0"/>
-          <w:numId w:val="1004"/>
-        </w:numPr>
-      </w:pPr>
-      <w:r>
-        <w:rPr>
-          <w:b/>
-          <w:bCs/>
-        </w:rPr>
-        <w:t xml:space="preserve">Price a workbook without the UI:</w:t>
-      </w:r>
-      <w:r>
-        <w:t xml:space="preserve"> </w:t>
-      </w:r>
-      <w:r>
-        <w:t xml:space="preserve">source</w:t>
-      </w:r>
-      <w:r>
-        <w:t xml:space="preserve"> </w:t>
-      </w:r>
-      <w:r>
-        <w:rPr>
-          <w:rStyle w:val="VerbatimChar"/>
-        </w:rPr>
-        <w:t xml:space="preserve">app.R</w:t>
-      </w:r>
-      <w:r>
-        <w:t xml:space="preserve"> </w:t>
-      </w:r>
-      <w:r>
-        <w:t xml:space="preserve">(which loads every module)</w:t>
-      </w:r>
-      <w:r>
-        <w:t xml:space="preserve"> </w:t>
-      </w:r>
-      <w:r>
-        <w:t xml:space="preserve">then call</w:t>
-      </w:r>
-      <w:r>
-        <w:t xml:space="preserve"> </w:t>
-      </w:r>
-      <w:r>
-        <w:rPr>
-          <w:rStyle w:val="VerbatimChar"/>
-        </w:rPr>
-        <w:t xml:space="preserve">run_pricing("../input.xlsx", overrides = list(...))</w:t>
-      </w:r>
-      <w:r>
-        <w:t xml:space="preserve">.</w:t>
       </w:r>
     </w:p>
     <w:p>

</xml_diff>

<commit_message>
Stop directing readers to engine\start.bat
start.vbs already calls it internally, so there is no need to surface
it as a second thing to try. If .vbs is blocked, the guidance now
points straight to Start in RStudio.R, in README and the technical docs.
</commit_message>
<xml_diff>
--- a/Technical documentation.docx
+++ b/Technical documentation.docx
@@ -911,6 +911,14 @@
       <w:r>
         <w:t xml:space="preserve">browser.</w:t>
       </w:r>
+    </w:p>
+    <w:p>
+      <w:pPr>
+        <w:pStyle w:val="BodyText"/>
+      </w:pPr>
+      <w:r>
+        <w:t xml:space="preserve">On first run the launcher calls</w:t>
+      </w:r>
       <w:r>
         <w:t xml:space="preserve"> </w:t>
       </w:r>
@@ -918,19 +926,28 @@
         <w:rPr>
           <w:rStyle w:val="VerbatimChar"/>
         </w:rPr>
-        <w:t xml:space="preserve">engine\start.bat</w:t>
-      </w:r>
-      <w:r>
-        <w:t xml:space="preserve"> </w:t>
-      </w:r>
-      <w:r>
-        <w:t xml:space="preserve">does the same with a visible console, which is</w:t>
-      </w:r>
-      <w:r>
-        <w:t xml:space="preserve"> </w:t>
-      </w:r>
-      <w:r>
-        <w:t xml:space="preserve">useful for troubleshooting.</w:t>
+        <w:t xml:space="preserve">install_deps.R</w:t>
+      </w:r>
+      <w:r>
+        <w:t xml:space="preserve">, which installs any missing</w:t>
+      </w:r>
+      <w:r>
+        <w:t xml:space="preserve"> </w:t>
+      </w:r>
+      <w:r>
+        <w:t xml:space="preserve">packages and then re-checks them. If a required package cannot be installed (for</w:t>
+      </w:r>
+      <w:r>
+        <w:t xml:space="preserve"> </w:t>
+      </w:r>
+      <w:r>
+        <w:t xml:space="preserve">example, no internet or a corporate firewall), it prints a clear message</w:t>
+      </w:r>
+      <w:r>
+        <w:t xml:space="preserve"> </w:t>
+      </w:r>
+      <w:r>
+        <w:t xml:space="preserve">explaining what to do rather than failing silently.</w:t>
       </w:r>
     </w:p>
     <w:p>
@@ -938,66 +955,13 @@
         <w:pStyle w:val="BodyText"/>
       </w:pPr>
       <w:r>
-        <w:t xml:space="preserve">On first run the launcher calls</w:t>
-      </w:r>
-      <w:r>
-        <w:t xml:space="preserve"> </w:t>
+        <w:t xml:space="preserve">Some company computers block script files (</w:t>
       </w:r>
       <w:r>
         <w:rPr>
           <w:rStyle w:val="VerbatimChar"/>
         </w:rPr>
-        <w:t xml:space="preserve">install_deps.R</w:t>
-      </w:r>
-      <w:r>
-        <w:t xml:space="preserve">, which installs any missing</w:t>
-      </w:r>
-      <w:r>
-        <w:t xml:space="preserve"> </w:t>
-      </w:r>
-      <w:r>
-        <w:t xml:space="preserve">packages and then re-checks them. If a required package cannot be installed (for</w:t>
-      </w:r>
-      <w:r>
-        <w:t xml:space="preserve"> </w:t>
-      </w:r>
-      <w:r>
-        <w:t xml:space="preserve">example, no internet or a corporate firewall), it prints a clear message</w:t>
-      </w:r>
-      <w:r>
-        <w:t xml:space="preserve"> </w:t>
-      </w:r>
-      <w:r>
-        <w:t xml:space="preserve">explaining what to do rather than failing silently.</w:t>
-      </w:r>
-    </w:p>
-    <w:p>
-      <w:pPr>
-        <w:pStyle w:val="BodyText"/>
-      </w:pPr>
-      <w:r>
-        <w:t xml:space="preserve">Some company computers block script files (</w:t>
-      </w:r>
-      <w:r>
-        <w:rPr>
-          <w:rStyle w:val="VerbatimChar"/>
-        </w:rPr>
         <w:t xml:space="preserve">.vbs</w:t>
-      </w:r>
-      <w:r>
-        <w:t xml:space="preserve"> </w:t>
-      </w:r>
-      <w:r>
-        <w:t xml:space="preserve">and</w:t>
-      </w:r>
-      <w:r>
-        <w:t xml:space="preserve"> </w:t>
-      </w:r>
-      <w:r>
-        <w:rPr>
-          <w:rStyle w:val="VerbatimChar"/>
-        </w:rPr>
-        <w:t xml:space="preserve">.bat</w:t>
       </w:r>
       <w:r>
         <w:t xml:space="preserve">) outright, so</w:t>
@@ -1237,15 +1201,6 @@
               <w:t xml:space="preserve">.vbs</w:t>
             </w:r>
             <w:r>
-              <w:t xml:space="preserve">/</w:t>
-            </w:r>
-            <w:r>
-              <w:rPr>
-                <w:rStyle w:val="VerbatimChar"/>
-              </w:rPr>
-              <w:t xml:space="preserve">.bat</w:t>
-            </w:r>
-            <w:r>
               <w:t xml:space="preserve"> </w:t>
             </w:r>
             <w:r>
@@ -1578,40 +1533,16 @@
         <w:t xml:space="preserve"> </w:t>
       </w:r>
       <w:r>
+        <w:t xml:space="preserve">No commands and no R knowledge are required. If</w:t>
+      </w:r>
+      <w:r>
+        <w:t xml:space="preserve"> </w:t>
+      </w:r>
+      <w:r>
         <w:rPr>
           <w:rStyle w:val="VerbatimChar"/>
         </w:rPr>
-        <w:t xml:space="preserve">engine\start.bat</w:t>
-      </w:r>
-      <w:r>
-        <w:t xml:space="preserve"> </w:t>
-      </w:r>
-      <w:r>
-        <w:t xml:space="preserve">does the same with a visible console, for troubleshooting.</w:t>
-      </w:r>
-      <w:r>
-        <w:t xml:space="preserve"> </w:t>
-      </w:r>
-      <w:r>
-        <w:t xml:space="preserve">No commands and no R knowledge are required. If</w:t>
-      </w:r>
-      <w:r>
-        <w:t xml:space="preserve"> </w:t>
-      </w:r>
-      <w:r>
-        <w:rPr>
-          <w:rStyle w:val="VerbatimChar"/>
-        </w:rPr>
         <w:t xml:space="preserve">.vbs</w:t>
-      </w:r>
-      <w:r>
-        <w:t xml:space="preserve">/</w:t>
-      </w:r>
-      <w:r>
-        <w:rPr>
-          <w:rStyle w:val="VerbatimChar"/>
-        </w:rPr>
-        <w:t xml:space="preserve">.bat</w:t>
       </w:r>
       <w:r>
         <w:t xml:space="preserve"> </w:t>

</xml_diff>